<commit_message>
commit for free (13.02.2025) + delete
</commit_message>
<xml_diff>
--- a/Бесполезные вещи/Шаблон проектная работа.docx
+++ b/Бесполезные вещи/Шаблон проектная работа.docx
@@ -9,14 +9,16 @@
         <w:ind w:firstLine="567"/>
         <w:jc w:val="center"/>
         <w:rPr>
-          <w:rFonts w:ascii="Times New Roman" w:hAnsi="Times New Roman" w:eastAsia="Times New Roman" w:cs="Times New Roman"/>
-          <w:sz w:val="28"/>
-          <w:szCs w:val="28"/>
-        </w:rPr>
-      </w:pPr>
-      <w:r>
-        <w:rPr>
-          <w:rFonts w:eastAsia="Times New Roman" w:cs="Times New Roman" w:ascii="Times New Roman" w:hAnsi="Times New Roman"/>
+          <w:rFonts w:ascii="Times New Roman" w:hAnsi="Times New Roman"/>
+          <w:b/>
+          <w:bCs/>
+        </w:rPr>
+      </w:pPr>
+      <w:r>
+        <w:rPr>
+          <w:rFonts w:eastAsia="Times New Roman" w:cs="Times New Roman" w:ascii="Times New Roman" w:hAnsi="Times New Roman"/>
+          <w:b/>
+          <w:bCs/>
           <w:sz w:val="28"/>
           <w:szCs w:val="28"/>
         </w:rPr>
@@ -30,14 +32,16 @@
         <w:ind w:firstLine="567"/>
         <w:jc w:val="center"/>
         <w:rPr>
-          <w:rFonts w:ascii="Times New Roman" w:hAnsi="Times New Roman" w:eastAsia="Times New Roman" w:cs="Times New Roman"/>
-          <w:sz w:val="28"/>
-          <w:szCs w:val="28"/>
-        </w:rPr>
-      </w:pPr>
-      <w:r>
-        <w:rPr>
-          <w:rFonts w:eastAsia="Times New Roman" w:cs="Times New Roman" w:ascii="Times New Roman" w:hAnsi="Times New Roman"/>
+          <w:rFonts w:ascii="Times New Roman" w:hAnsi="Times New Roman"/>
+          <w:b/>
+          <w:bCs/>
+        </w:rPr>
+      </w:pPr>
+      <w:r>
+        <w:rPr>
+          <w:rFonts w:eastAsia="Times New Roman" w:cs="Times New Roman" w:ascii="Times New Roman" w:hAnsi="Times New Roman"/>
+          <w:b/>
+          <w:bCs/>
           <w:sz w:val="28"/>
           <w:szCs w:val="28"/>
         </w:rPr>
@@ -51,14 +55,16 @@
         <w:ind w:firstLine="567"/>
         <w:jc w:val="center"/>
         <w:rPr>
-          <w:rFonts w:ascii="Times New Roman" w:hAnsi="Times New Roman" w:eastAsia="Times New Roman" w:cs="Times New Roman"/>
-          <w:sz w:val="28"/>
-          <w:szCs w:val="28"/>
-        </w:rPr>
-      </w:pPr>
-      <w:r>
-        <w:rPr>
-          <w:rFonts w:eastAsia="Times New Roman" w:cs="Times New Roman" w:ascii="Times New Roman" w:hAnsi="Times New Roman"/>
+          <w:rFonts w:ascii="Times New Roman" w:hAnsi="Times New Roman"/>
+          <w:b/>
+          <w:bCs/>
+        </w:rPr>
+      </w:pPr>
+      <w:r>
+        <w:rPr>
+          <w:rFonts w:eastAsia="Times New Roman" w:cs="Times New Roman" w:ascii="Times New Roman" w:hAnsi="Times New Roman"/>
+          <w:b/>
+          <w:bCs/>
           <w:sz w:val="28"/>
           <w:szCs w:val="28"/>
         </w:rPr>
@@ -132,41 +138,22 @@
         <w:ind w:firstLine="567"/>
         <w:jc w:val="center"/>
         <w:rPr>
-          <w:rFonts w:ascii="Times New Roman" w:hAnsi="Times New Roman" w:eastAsia="Times New Roman" w:cs="Times New Roman"/>
-          <w:sz w:val="28"/>
-          <w:szCs w:val="28"/>
-        </w:rPr>
-      </w:pPr>
-      <w:r>
-        <w:rPr>
-          <w:rFonts w:eastAsia="Times New Roman" w:cs="Times New Roman" w:ascii="Times New Roman" w:hAnsi="Times New Roman"/>
-          <w:sz w:val="28"/>
-          <w:szCs w:val="28"/>
-        </w:rPr>
-        <w:t>Тема проектной работы</w:t>
-      </w:r>
-    </w:p>
-    <w:p>
-      <w:pPr>
-        <w:pStyle w:val="Normal"/>
-        <w:spacing w:lineRule="auto" w:line="360" w:before="0" w:after="0"/>
-        <w:ind w:firstLine="567"/>
-        <w:jc w:val="center"/>
-        <w:rPr>
-          <w:rFonts w:ascii="Times New Roman" w:hAnsi="Times New Roman" w:eastAsia="Times New Roman" w:cs="Times New Roman"/>
-          <w:sz w:val="28"/>
-          <w:szCs w:val="28"/>
-        </w:rPr>
-      </w:pPr>
-      <w:bookmarkStart w:id="0" w:name="_GoBack"/>
-      <w:bookmarkEnd w:id="0"/>
-      <w:r>
-        <w:rPr>
-          <w:rFonts w:eastAsia="Times New Roman" w:cs="Times New Roman" w:ascii="Times New Roman" w:hAnsi="Times New Roman"/>
-          <w:sz w:val="28"/>
-          <w:szCs w:val="28"/>
-        </w:rPr>
-        <w:t>«Велосборщик»</w:t>
+          <w:rFonts w:ascii="Times New Roman" w:hAnsi="Times New Roman"/>
+          <w:b/>
+          <w:bCs/>
+          <w:sz w:val="32"/>
+          <w:szCs w:val="32"/>
+        </w:rPr>
+      </w:pPr>
+      <w:r>
+        <w:rPr>
+          <w:rFonts w:eastAsia="Times New Roman" w:cs="Times New Roman" w:ascii="Times New Roman" w:hAnsi="Times New Roman"/>
+          <w:b/>
+          <w:bCs/>
+          <w:sz w:val="32"/>
+          <w:szCs w:val="32"/>
+        </w:rPr>
+        <w:t>Велосборщик</w:t>
       </w:r>
     </w:p>
     <w:p>
@@ -247,7 +234,6 @@
           <w:sz w:val="28"/>
           <w:szCs w:val="28"/>
         </w:rPr>
-        <w:t>Автор:</w:t>
       </w:r>
     </w:p>
     <w:p>
@@ -268,7 +254,6 @@
           <w:sz w:val="28"/>
           <w:szCs w:val="28"/>
         </w:rPr>
-        <w:t>Булычев Алексей Андреевич</w:t>
       </w:r>
     </w:p>
     <w:p>
@@ -289,7 +274,6 @@
           <w:sz w:val="28"/>
           <w:szCs w:val="28"/>
         </w:rPr>
-        <w:t>ученик 10 класса ГБОУ Школа №1195</w:t>
       </w:r>
     </w:p>
     <w:p>
@@ -310,7 +294,6 @@
           <w:sz w:val="28"/>
           <w:szCs w:val="28"/>
         </w:rPr>
-        <w:t>Руководитель:</w:t>
       </w:r>
     </w:p>
     <w:p>
@@ -331,7 +314,6 @@
           <w:sz w:val="28"/>
           <w:szCs w:val="28"/>
         </w:rPr>
-        <w:t>Боцуляк Татьяна Павловна</w:t>
       </w:r>
     </w:p>
     <w:p>
@@ -352,49 +334,6 @@
           <w:sz w:val="28"/>
           <w:szCs w:val="28"/>
         </w:rPr>
-        <w:t>учитель (предмет) ГБОУ Школа №1195</w:t>
-      </w:r>
-    </w:p>
-    <w:p>
-      <w:pPr>
-        <w:pStyle w:val="Normal"/>
-        <w:widowControl w:val="false"/>
-        <w:spacing w:lineRule="auto" w:line="276" w:before="0" w:after="0"/>
-        <w:rPr>
-          <w:rFonts w:ascii="Times New Roman" w:hAnsi="Times New Roman" w:eastAsia="Times New Roman" w:cs="Times New Roman"/>
-          <w:sz w:val="28"/>
-          <w:szCs w:val="28"/>
-        </w:rPr>
-      </w:pPr>
-      <w:r>
-        <w:rPr>
-          <w:rFonts w:eastAsia="Times New Roman" w:cs="Times New Roman" w:ascii="Times New Roman" w:hAnsi="Times New Roman"/>
-          <w:sz w:val="28"/>
-          <w:szCs w:val="28"/>
-        </w:rPr>
-      </w:r>
-    </w:p>
-    <w:p>
-      <w:pPr>
-        <w:pStyle w:val="Normal"/>
-        <w:tabs>
-          <w:tab w:val="clear" w:pos="720"/>
-          <w:tab w:val="center" w:pos="4677" w:leader="none"/>
-          <w:tab w:val="right" w:pos="9355" w:leader="none"/>
-        </w:tabs>
-        <w:spacing w:lineRule="auto" w:line="240" w:before="0" w:after="0"/>
-        <w:rPr>
-          <w:rFonts w:ascii="Times New Roman" w:hAnsi="Times New Roman" w:eastAsia="Times New Roman" w:cs="Times New Roman"/>
-          <w:sz w:val="28"/>
-          <w:szCs w:val="28"/>
-        </w:rPr>
-      </w:pPr>
-      <w:r>
-        <w:rPr>
-          <w:rFonts w:eastAsia="Times New Roman" w:cs="Times New Roman" w:ascii="Times New Roman" w:hAnsi="Times New Roman"/>
-          <w:sz w:val="28"/>
-          <w:szCs w:val="28"/>
-        </w:rPr>
       </w:r>
     </w:p>
     <w:p>
@@ -415,7 +354,6 @@
           <w:sz w:val="28"/>
           <w:szCs w:val="28"/>
         </w:rPr>
-        <w:t>«К защите рекомендован»</w:t>
       </w:r>
     </w:p>
     <w:p>
@@ -436,95 +374,194 @@
           <w:sz w:val="28"/>
           <w:szCs w:val="28"/>
         </w:rPr>
-        <w:t>_________________________</w:t>
-      </w:r>
-    </w:p>
-    <w:p>
-      <w:pPr>
-        <w:pStyle w:val="Normal"/>
-        <w:spacing w:lineRule="auto" w:line="360" w:before="0" w:after="0"/>
-        <w:ind w:firstLine="567"/>
-        <w:jc w:val="right"/>
-        <w:rPr>
-          <w:rFonts w:ascii="Times New Roman" w:hAnsi="Times New Roman" w:eastAsia="Times New Roman" w:cs="Times New Roman"/>
-          <w:sz w:val="28"/>
-          <w:szCs w:val="28"/>
-          <w:vertAlign w:val="subscript"/>
-        </w:rPr>
-      </w:pPr>
-      <w:r>
-        <w:rPr>
-          <w:rFonts w:eastAsia="Times New Roman" w:cs="Times New Roman" w:ascii="Times New Roman" w:hAnsi="Times New Roman"/>
-          <w:sz w:val="28"/>
-          <w:szCs w:val="28"/>
-          <w:vertAlign w:val="subscript"/>
-        </w:rPr>
-        <w:t>(подпись руководителя)</w:t>
-      </w:r>
-    </w:p>
-    <w:p>
-      <w:pPr>
-        <w:pStyle w:val="Normal"/>
-        <w:spacing w:lineRule="auto" w:line="360" w:before="0" w:after="0"/>
-        <w:ind w:firstLine="567"/>
-        <w:jc w:val="right"/>
-        <w:rPr>
-          <w:rFonts w:ascii="Times New Roman" w:hAnsi="Times New Roman" w:eastAsia="Times New Roman" w:cs="Times New Roman"/>
-          <w:sz w:val="28"/>
-          <w:szCs w:val="28"/>
-        </w:rPr>
-      </w:pPr>
-      <w:r>
-        <w:rPr>
-          <w:rFonts w:eastAsia="Times New Roman" w:cs="Times New Roman" w:ascii="Times New Roman" w:hAnsi="Times New Roman"/>
-          <w:sz w:val="28"/>
-          <w:szCs w:val="28"/>
-        </w:rPr>
-        <w:t>_________________________</w:t>
-      </w:r>
-    </w:p>
-    <w:p>
-      <w:pPr>
-        <w:pStyle w:val="Normal"/>
-        <w:spacing w:lineRule="auto" w:line="360" w:before="0" w:after="0"/>
-        <w:ind w:firstLine="567"/>
-        <w:jc w:val="right"/>
-        <w:rPr>
-          <w:rFonts w:ascii="Times New Roman" w:hAnsi="Times New Roman" w:eastAsia="Times New Roman" w:cs="Times New Roman"/>
-          <w:sz w:val="28"/>
-          <w:szCs w:val="28"/>
-          <w:vertAlign w:val="subscript"/>
-        </w:rPr>
-      </w:pPr>
-      <w:r>
-        <w:rPr>
-          <w:rFonts w:eastAsia="Times New Roman" w:cs="Times New Roman" w:ascii="Times New Roman" w:hAnsi="Times New Roman"/>
-          <w:sz w:val="28"/>
-          <w:szCs w:val="28"/>
-          <w:vertAlign w:val="subscript"/>
-        </w:rPr>
-        <w:t>(расшифровка подписи)</w:t>
-      </w:r>
-    </w:p>
-    <w:p>
-      <w:pPr>
-        <w:pStyle w:val="Normal"/>
-        <w:spacing w:lineRule="auto" w:line="360" w:before="0" w:after="0"/>
-        <w:ind w:firstLine="567"/>
-        <w:jc w:val="right"/>
-        <w:rPr>
-          <w:rFonts w:ascii="Times New Roman" w:hAnsi="Times New Roman" w:eastAsia="Times New Roman" w:cs="Times New Roman"/>
-          <w:sz w:val="28"/>
-          <w:szCs w:val="28"/>
-        </w:rPr>
-      </w:pPr>
-      <w:r>
-        <w:rPr>
-          <w:rFonts w:eastAsia="Times New Roman" w:cs="Times New Roman" w:ascii="Times New Roman" w:hAnsi="Times New Roman"/>
-          <w:sz w:val="28"/>
-          <w:szCs w:val="28"/>
-        </w:rPr>
-        <w:t>«___»_____________20__ г.</w:t>
+      </w:r>
+    </w:p>
+    <w:p>
+      <w:pPr>
+        <w:pStyle w:val="Normal"/>
+        <w:widowControl/>
+        <w:suppressAutoHyphens w:val="true"/>
+        <w:bidi w:val="0"/>
+        <w:spacing w:lineRule="auto" w:line="240" w:before="0" w:after="0"/>
+        <w:ind w:hanging="0" w:left="5102" w:right="0"/>
+        <w:jc w:val="left"/>
+        <w:rPr/>
+      </w:pPr>
+      <w:r>
+        <w:rPr>
+          <w:rFonts w:eastAsia="Times New Roman" w:cs="Times New Roman" w:ascii="Times New Roman" w:hAnsi="Times New Roman"/>
+          <w:sz w:val="28"/>
+          <w:szCs w:val="28"/>
+        </w:rPr>
+        <w:t>Участник:</w:t>
+      </w:r>
+    </w:p>
+    <w:p>
+      <w:pPr>
+        <w:pStyle w:val="Normal"/>
+        <w:widowControl/>
+        <w:suppressAutoHyphens w:val="true"/>
+        <w:bidi w:val="0"/>
+        <w:spacing w:lineRule="auto" w:line="240" w:before="0" w:after="0"/>
+        <w:ind w:hanging="0" w:left="5102" w:right="0"/>
+        <w:jc w:val="left"/>
+        <w:rPr/>
+      </w:pPr>
+      <w:r>
+        <w:rPr>
+          <w:rFonts w:eastAsia="Times New Roman" w:cs="Times New Roman" w:ascii="Times New Roman" w:hAnsi="Times New Roman"/>
+          <w:sz w:val="28"/>
+          <w:szCs w:val="28"/>
+        </w:rPr>
+        <w:t>Булычев Алексей Андреевич</w:t>
+      </w:r>
+    </w:p>
+    <w:p>
+      <w:pPr>
+        <w:pStyle w:val="Normal"/>
+        <w:widowControl/>
+        <w:suppressAutoHyphens w:val="true"/>
+        <w:bidi w:val="0"/>
+        <w:spacing w:lineRule="auto" w:line="240" w:before="0" w:after="0"/>
+        <w:ind w:hanging="0" w:left="5102" w:right="0"/>
+        <w:jc w:val="left"/>
+        <w:rPr/>
+      </w:pPr>
+      <w:r>
+        <w:rPr>
+          <w:rFonts w:eastAsia="Times New Roman" w:cs="Times New Roman" w:ascii="Times New Roman" w:hAnsi="Times New Roman"/>
+          <w:sz w:val="28"/>
+          <w:szCs w:val="28"/>
+        </w:rPr>
+        <w:t>ученик 10 класса ГБОУ Школ</w:t>
+      </w:r>
+      <w:r>
+        <w:rPr>
+          <w:rFonts w:eastAsia="Times New Roman" w:cs="Times New Roman" w:ascii="Times New Roman" w:hAnsi="Times New Roman"/>
+          <w:sz w:val="28"/>
+          <w:szCs w:val="28"/>
+        </w:rPr>
+        <w:t>ы</w:t>
+      </w:r>
+      <w:r>
+        <w:rPr>
+          <w:rFonts w:eastAsia="Times New Roman" w:cs="Times New Roman" w:ascii="Times New Roman" w:hAnsi="Times New Roman"/>
+          <w:sz w:val="28"/>
+          <w:szCs w:val="28"/>
+        </w:rPr>
+        <w:t xml:space="preserve"> №1195</w:t>
+      </w:r>
+    </w:p>
+    <w:p>
+      <w:pPr>
+        <w:pStyle w:val="Normal"/>
+        <w:widowControl/>
+        <w:suppressAutoHyphens w:val="true"/>
+        <w:bidi w:val="0"/>
+        <w:spacing w:lineRule="auto" w:line="240" w:before="0" w:after="0"/>
+        <w:ind w:hanging="0" w:left="5102" w:right="0"/>
+        <w:jc w:val="left"/>
+        <w:rPr/>
+      </w:pPr>
+      <w:r>
+        <w:rPr>
+          <w:rFonts w:eastAsia="Times New Roman" w:cs="Times New Roman" w:ascii="Times New Roman" w:hAnsi="Times New Roman"/>
+          <w:sz w:val="28"/>
+          <w:szCs w:val="28"/>
+        </w:rPr>
+        <w:t>Руководитель:</w:t>
+      </w:r>
+    </w:p>
+    <w:p>
+      <w:pPr>
+        <w:pStyle w:val="Normal"/>
+        <w:widowControl/>
+        <w:suppressAutoHyphens w:val="true"/>
+        <w:bidi w:val="0"/>
+        <w:spacing w:lineRule="auto" w:line="240" w:before="0" w:after="0"/>
+        <w:ind w:hanging="0" w:left="5102" w:right="0"/>
+        <w:jc w:val="left"/>
+        <w:rPr/>
+      </w:pPr>
+      <w:r>
+        <w:rPr>
+          <w:rFonts w:eastAsia="Times New Roman" w:cs="Times New Roman" w:ascii="Times New Roman" w:hAnsi="Times New Roman"/>
+          <w:sz w:val="28"/>
+          <w:szCs w:val="28"/>
+        </w:rPr>
+        <w:t>Боцуляк Татьяна Павловна</w:t>
+      </w:r>
+    </w:p>
+    <w:p>
+      <w:pPr>
+        <w:pStyle w:val="Normal"/>
+        <w:widowControl/>
+        <w:suppressAutoHyphens w:val="true"/>
+        <w:bidi w:val="0"/>
+        <w:spacing w:lineRule="auto" w:line="240" w:before="0" w:after="0"/>
+        <w:ind w:hanging="0" w:left="5102" w:right="0"/>
+        <w:jc w:val="left"/>
+        <w:rPr/>
+      </w:pPr>
+      <w:r>
+        <w:rPr>
+          <w:rFonts w:eastAsia="Times New Roman" w:cs="Times New Roman" w:ascii="Times New Roman" w:hAnsi="Times New Roman"/>
+          <w:sz w:val="28"/>
+          <w:szCs w:val="28"/>
+        </w:rPr>
+        <w:t xml:space="preserve">учитель </w:t>
+      </w:r>
+      <w:r>
+        <w:rPr>
+          <w:rFonts w:eastAsia="Times New Roman" w:cs="Times New Roman" w:ascii="Times New Roman" w:hAnsi="Times New Roman"/>
+          <w:sz w:val="28"/>
+          <w:szCs w:val="28"/>
+        </w:rPr>
+        <w:t xml:space="preserve">информатики </w:t>
+      </w:r>
+      <w:r>
+        <w:rPr>
+          <w:rFonts w:eastAsia="Times New Roman" w:cs="Times New Roman" w:ascii="Times New Roman" w:hAnsi="Times New Roman"/>
+          <w:sz w:val="28"/>
+          <w:szCs w:val="28"/>
+        </w:rPr>
+        <w:t>ГБОУ Школ</w:t>
+      </w:r>
+      <w:r>
+        <w:rPr>
+          <w:rFonts w:eastAsia="Times New Roman" w:cs="Times New Roman" w:ascii="Times New Roman" w:hAnsi="Times New Roman"/>
+          <w:sz w:val="28"/>
+          <w:szCs w:val="28"/>
+        </w:rPr>
+        <w:t>ы</w:t>
+      </w:r>
+      <w:r>
+        <w:rPr>
+          <w:rFonts w:eastAsia="Times New Roman" w:cs="Times New Roman" w:ascii="Times New Roman" w:hAnsi="Times New Roman"/>
+          <w:sz w:val="28"/>
+          <w:szCs w:val="28"/>
+        </w:rPr>
+        <w:t xml:space="preserve"> №1195</w:t>
+      </w:r>
+    </w:p>
+    <w:p>
+      <w:pPr>
+        <w:pStyle w:val="Normal"/>
+        <w:widowControl w:val="false"/>
+        <w:spacing w:lineRule="auto" w:line="240" w:before="0" w:after="0"/>
+        <w:jc w:val="left"/>
+        <w:rPr>
+          <w:rFonts w:eastAsia="Times New Roman" w:cs="Times New Roman"/>
+          <w:sz w:val="28"/>
+          <w:szCs w:val="28"/>
+        </w:rPr>
+      </w:pPr>
+      <w:r>
+        <w:rPr>
+          <w:rFonts w:eastAsia="Times New Roman" w:cs="Times New Roman"/>
+          <w:sz w:val="28"/>
+          <w:szCs w:val="28"/>
+        </w:rPr>
       </w:r>
     </w:p>
     <w:p>
@@ -555,20 +592,22 @@
         <w:pStyle w:val="Normal"/>
         <w:spacing w:lineRule="auto" w:line="360" w:before="0" w:after="0"/>
         <w:ind w:firstLine="567"/>
-        <w:jc w:val="center"/>
+        <w:jc w:val="right"/>
         <w:rPr>
           <w:rFonts w:ascii="Times New Roman" w:hAnsi="Times New Roman" w:eastAsia="Times New Roman" w:cs="Times New Roman"/>
-          <w:sz w:val="28"/>
-          <w:szCs w:val="28"/>
-        </w:rPr>
-      </w:pPr>
-      <w:r>
-        <w:rPr>
-          <w:rFonts w:eastAsia="Times New Roman" w:cs="Times New Roman" w:ascii="Times New Roman" w:hAnsi="Times New Roman"/>
-          <w:sz w:val="28"/>
-          <w:szCs w:val="28"/>
-        </w:rPr>
-        <w:t>Москва</w:t>
+          <w:i/>
+          <w:i/>
+          <w:sz w:val="28"/>
+          <w:szCs w:val="28"/>
+        </w:rPr>
+      </w:pPr>
+      <w:r>
+        <w:rPr>
+          <w:rFonts w:eastAsia="Times New Roman" w:cs="Times New Roman" w:ascii="Times New Roman" w:hAnsi="Times New Roman"/>
+          <w:i/>
+          <w:sz w:val="28"/>
+          <w:szCs w:val="28"/>
+        </w:rPr>
       </w:r>
     </w:p>
     <w:p>
@@ -578,29 +617,47 @@
         <w:ind w:firstLine="567"/>
         <w:jc w:val="center"/>
         <w:rPr>
-          <w:rFonts w:ascii="Times New Roman" w:hAnsi="Times New Roman" w:eastAsia="Times New Roman" w:cs="Times New Roman"/>
-          <w:sz w:val="28"/>
-          <w:szCs w:val="28"/>
-        </w:rPr>
-      </w:pPr>
-      <w:r>
-        <w:rPr>
-          <w:rFonts w:eastAsia="Times New Roman" w:cs="Times New Roman" w:ascii="Times New Roman" w:hAnsi="Times New Roman"/>
-          <w:sz w:val="28"/>
-          <w:szCs w:val="28"/>
-        </w:rPr>
-        <w:t>20__ г.</w:t>
-      </w:r>
-    </w:p>
-    <w:p>
-      <w:pPr>
-        <w:pStyle w:val="Normal"/>
-        <w:widowControl w:val="false"/>
-        <w:spacing w:lineRule="auto" w:line="276" w:before="0" w:after="0"/>
-        <w:rPr/>
-      </w:pPr>
-      <w:r>
-        <w:rPr/>
+          <w:rFonts w:ascii="Times New Roman" w:hAnsi="Times New Roman"/>
+          <w:b/>
+          <w:bCs/>
+        </w:rPr>
+      </w:pPr>
+      <w:r>
+        <w:rPr>
+          <w:rFonts w:eastAsia="Times New Roman" w:cs="Times New Roman" w:ascii="Times New Roman" w:hAnsi="Times New Roman"/>
+          <w:b/>
+          <w:bCs/>
+          <w:sz w:val="28"/>
+          <w:szCs w:val="28"/>
+        </w:rPr>
+        <w:t>Москва, 2025</w:t>
+      </w:r>
+    </w:p>
+    <w:p>
+      <w:pPr>
+        <w:pStyle w:val="Normal"/>
+        <w:widowControl/>
+        <w:numPr>
+          <w:ilvl w:val="0"/>
+          <w:numId w:val="0"/>
+        </w:numPr>
+        <w:suppressAutoHyphens w:val="true"/>
+        <w:bidi w:val="0"/>
+        <w:spacing w:lineRule="auto" w:line="360" w:before="0" w:after="160"/>
+        <w:ind w:hanging="0" w:left="850" w:right="0"/>
+        <w:jc w:val="left"/>
+        <w:rPr>
+          <w:rFonts w:ascii="Times New Roman" w:hAnsi="Times New Roman"/>
+          <w:b/>
+          <w:bCs/>
+        </w:rPr>
+      </w:pPr>
+      <w:r>
+        <w:rPr>
+          <w:rFonts w:ascii="Times New Roman" w:hAnsi="Times New Roman"/>
+          <w:b/>
+          <w:bCs/>
+        </w:rPr>
       </w:r>
       <w:r>
         <w:br w:type="page"/>
@@ -608,24 +665,20 @@
     </w:p>
     <w:p>
       <w:pPr>
-        <w:pStyle w:val="Normal"/>
+        <w:pStyle w:val="Heading3"/>
         <w:numPr>
           <w:ilvl w:val="0"/>
           <w:numId w:val="5"/>
         </w:numPr>
-        <w:pBdr/>
-        <w:spacing w:lineRule="auto" w:line="360" w:before="0" w:after="160"/>
-        <w:rPr>
-          <w:rFonts w:ascii="Times New Roman" w:hAnsi="Times New Roman" w:eastAsia="Times New Roman" w:cs="Times New Roman"/>
-          <w:color w:val="000000"/>
-          <w:sz w:val="28"/>
-          <w:szCs w:val="28"/>
-        </w:rPr>
-      </w:pPr>
-      <w:r>
-        <w:rPr>
-          <w:rFonts w:eastAsia="Times New Roman" w:cs="Times New Roman" w:ascii="Times New Roman" w:hAnsi="Times New Roman"/>
-          <w:b/>
+        <w:spacing w:lineRule="auto" w:line="360" w:before="0" w:after="80"/>
+        <w:ind w:firstLine="709" w:left="0"/>
+        <w:rPr>
+          <w:rFonts w:ascii="Times New Roman" w:hAnsi="Times New Roman"/>
+        </w:rPr>
+      </w:pPr>
+      <w:r>
+        <w:rPr>
+          <w:rFonts w:eastAsia="Times New Roman" w:cs="Times New Roman" w:ascii="Times New Roman" w:hAnsi="Times New Roman"/>
           <w:sz w:val="28"/>
           <w:szCs w:val="28"/>
         </w:rPr>
@@ -634,7 +687,6 @@
       <w:r>
         <w:rPr>
           <w:rFonts w:eastAsia="Times New Roman" w:cs="Times New Roman" w:ascii="Times New Roman" w:hAnsi="Times New Roman"/>
-          <w:b/>
           <w:color w:val="000000"/>
           <w:sz w:val="28"/>
           <w:szCs w:val="28"/>
@@ -656,14 +708,12 @@
             <w:suppressLineNumbers/>
             <w:ind w:hanging="0" w:left="0"/>
             <w:rPr>
-              <w:b/>
-              <w:bCs/>
-              <w:sz w:val="32"/>
-              <w:szCs w:val="32"/>
+              <w:rFonts w:ascii="Times New Roman" w:hAnsi="Times New Roman"/>
             </w:rPr>
           </w:pPr>
           <w:r>
             <w:rPr>
+              <w:rFonts w:ascii="Times New Roman" w:hAnsi="Times New Roman"/>
               <w:b/>
               <w:bCs/>
               <w:sz w:val="32"/>
@@ -687,12 +737,18 @@
           <w:r>
             <w:rPr>
               <w:rStyle w:val="Style11"/>
+              <w:sz w:val="28"/>
+              <w:szCs w:val="28"/>
+              <w:rFonts w:ascii="Times New Roman" w:hAnsi="Times New Roman"/>
             </w:rPr>
             <w:instrText xml:space="preserve"> TOC \f \o "1-9" \h</w:instrText>
           </w:r>
           <w:r>
             <w:rPr>
               <w:rStyle w:val="Style11"/>
+              <w:sz w:val="28"/>
+              <w:szCs w:val="28"/>
+              <w:rFonts w:ascii="Times New Roman" w:hAnsi="Times New Roman"/>
             </w:rPr>
             <w:fldChar w:fldCharType="separate"/>
           </w:r>
@@ -700,8 +756,19 @@
             <w:r>
               <w:rPr>
                 <w:rStyle w:val="Style11"/>
+                <w:rFonts w:ascii="Times New Roman" w:hAnsi="Times New Roman"/>
+                <w:sz w:val="28"/>
+                <w:szCs w:val="28"/>
               </w:rPr>
               <w:t>2. Аннотация</w:t>
+            </w:r>
+            <w:r>
+              <w:rPr>
+                <w:rStyle w:val="Style11"/>
+                <w:rFonts w:ascii="Times New Roman" w:hAnsi="Times New Roman"/>
+                <w:sz w:val="28"/>
+                <w:szCs w:val="28"/>
+              </w:rPr>
               <w:tab/>
               <w:t>2</w:t>
             </w:r>
@@ -720,6 +787,9 @@
             <w:r>
               <w:rPr>
                 <w:rStyle w:val="Style11"/>
+                <w:rFonts w:ascii="Times New Roman" w:hAnsi="Times New Roman"/>
+                <w:sz w:val="28"/>
+                <w:szCs w:val="28"/>
               </w:rPr>
               <w:t>3. Введение</w:t>
               <w:tab/>
@@ -740,6 +810,9 @@
             <w:r>
               <w:rPr>
                 <w:rStyle w:val="Style11"/>
+                <w:rFonts w:ascii="Times New Roman" w:hAnsi="Times New Roman"/>
+                <w:sz w:val="28"/>
+                <w:szCs w:val="28"/>
               </w:rPr>
               <w:t>4. Теоретическая часть.</w:t>
               <w:tab/>
@@ -760,6 +833,9 @@
             <w:r>
               <w:rPr>
                 <w:rStyle w:val="Style11"/>
+                <w:rFonts w:ascii="Times New Roman" w:hAnsi="Times New Roman"/>
+                <w:sz w:val="28"/>
+                <w:szCs w:val="28"/>
               </w:rPr>
               <w:t>5. Практическая часть</w:t>
               <w:tab/>
@@ -780,6 +856,9 @@
             <w:r>
               <w:rPr>
                 <w:rStyle w:val="Style11"/>
+                <w:rFonts w:ascii="Times New Roman" w:hAnsi="Times New Roman"/>
+                <w:sz w:val="28"/>
+                <w:szCs w:val="28"/>
               </w:rPr>
               <w:t>6. Заключение</w:t>
               <w:tab/>
@@ -800,6 +879,9 @@
             <w:r>
               <w:rPr>
                 <w:rStyle w:val="Style11"/>
+                <w:rFonts w:ascii="Times New Roman" w:hAnsi="Times New Roman"/>
+                <w:sz w:val="28"/>
+                <w:szCs w:val="28"/>
               </w:rPr>
               <w:t>7. Список литературы</w:t>
               <w:tab/>
@@ -809,6 +891,9 @@
           <w:r>
             <w:rPr>
               <w:rStyle w:val="Style11"/>
+              <w:sz w:val="28"/>
+              <w:szCs w:val="28"/>
+              <w:rFonts w:ascii="Times New Roman" w:hAnsi="Times New Roman"/>
             </w:rPr>
             <w:fldChar w:fldCharType="end"/>
           </w:r>
@@ -822,73 +907,39 @@
           <w:ilvl w:val="0"/>
           <w:numId w:val="5"/>
         </w:numPr>
-        <w:rPr/>
-      </w:pPr>
-      <w:bookmarkStart w:id="1" w:name="__RefHeading___Toc862_3592309458"/>
-      <w:bookmarkEnd w:id="1"/>
-      <w:r>
-        <w:rPr/>
+        <w:spacing w:lineRule="auto" w:line="360" w:before="0" w:after="0"/>
+        <w:ind w:firstLine="709" w:left="0"/>
+        <w:rPr>
+          <w:rFonts w:ascii="Times New Roman" w:hAnsi="Times New Roman"/>
+        </w:rPr>
+      </w:pPr>
+      <w:bookmarkStart w:id="0" w:name="__RefHeading___Toc862_3592309458"/>
+      <w:bookmarkEnd w:id="0"/>
+      <w:r>
+        <w:rPr>
+          <w:rFonts w:ascii="Times New Roman" w:hAnsi="Times New Roman"/>
+        </w:rPr>
         <w:t>Аннотация</w:t>
       </w:r>
     </w:p>
     <w:p>
       <w:pPr>
         <w:pStyle w:val="Normal"/>
-        <w:pBdr/>
-        <w:spacing w:lineRule="auto" w:line="360" w:before="0" w:after="0"/>
-        <w:ind w:firstLine="567"/>
+        <w:spacing w:lineRule="auto" w:line="360" w:before="0" w:after="0"/>
+        <w:ind w:firstLine="709"/>
         <w:jc w:val="both"/>
         <w:rPr>
-          <w:rFonts w:ascii="Times New Roman" w:hAnsi="Times New Roman" w:eastAsia="Times New Roman" w:cs="Times New Roman"/>
-          <w:color w:val="000000"/>
-          <w:sz w:val="28"/>
-          <w:szCs w:val="28"/>
-        </w:rPr>
-      </w:pPr>
-      <w:r>
-        <w:rPr>
-          <w:rFonts w:eastAsia="Times New Roman" w:cs="Times New Roman" w:ascii="Times New Roman" w:hAnsi="Times New Roman"/>
-          <w:color w:val="000000"/>
-          <w:sz w:val="28"/>
-          <w:szCs w:val="28"/>
-        </w:rPr>
-        <w:t xml:space="preserve">Проект </w:t>
-      </w:r>
-      <w:r>
-        <w:rPr>
-          <w:rFonts w:eastAsia="Times New Roman" w:cs="Times New Roman" w:ascii="Times New Roman" w:hAnsi="Times New Roman"/>
-          <w:color w:val="000000"/>
-          <w:sz w:val="28"/>
-          <w:szCs w:val="28"/>
-        </w:rPr>
-        <w:t>Велосборщик</w:t>
-      </w:r>
-      <w:r>
-        <w:rPr>
-          <w:rFonts w:eastAsia="Times New Roman" w:cs="Times New Roman" w:ascii="Times New Roman" w:hAnsi="Times New Roman"/>
-          <w:color w:val="000000"/>
-          <w:sz w:val="28"/>
-          <w:szCs w:val="28"/>
-        </w:rPr>
-        <w:t xml:space="preserve"> представляет собой онлайн-платформу, посвященную созданию индивидуальных велосипедов. Пользователи смогут выбирать компоненты, такие как рамы, колеса и аксессуары, получая подробную информацию о каждом элементе. Платформа ориентирована на любителей велоспорта и тех, кто ищет </w:t>
-      </w:r>
-      <w:r>
-        <w:rPr>
-          <w:rFonts w:eastAsia="Times New Roman" w:cs="Times New Roman" w:ascii="Times New Roman" w:hAnsi="Times New Roman"/>
-          <w:color w:val="000000"/>
-          <w:sz w:val="28"/>
-          <w:szCs w:val="28"/>
-        </w:rPr>
-        <w:t>кастомные</w:t>
-      </w:r>
-      <w:r>
-        <w:rPr>
-          <w:rFonts w:eastAsia="Times New Roman" w:cs="Times New Roman" w:ascii="Times New Roman" w:hAnsi="Times New Roman"/>
-          <w:color w:val="000000"/>
-          <w:sz w:val="28"/>
-          <w:szCs w:val="28"/>
-        </w:rPr>
-        <w:t xml:space="preserve"> решения для своих нужд. Основные цели проекта включают упрощение процесса выбора, повышение информативности и создание удобного интерфейса. Сайт будет включать интеграцию с производителями, возможность пользователям делиться своими сборками и получать советы от экспертов.</w:t>
+          <w:rFonts w:ascii="Times New Roman" w:hAnsi="Times New Roman"/>
+        </w:rPr>
+      </w:pPr>
+      <w:r>
+        <w:rPr>
+          <w:rFonts w:eastAsia="Times New Roman" w:cs="Times New Roman" w:ascii="Times New Roman" w:hAnsi="Times New Roman"/>
+          <w:color w:val="000000"/>
+          <w:sz w:val="28"/>
+          <w:szCs w:val="28"/>
+        </w:rPr>
+        <w:t>Проект Велосборщик представляет собой онлайн-платформу, посвященную созданию индивидуальных велосипедов. Пользователи смогут выбирать компоненты, такие как рамы, колеса и аксессуары, получая подробную информацию о каждом элементе. Платформа ориентирована на любителей велоспорта и тех, кто ищет кастомные решения для своих нужд. Основные цели проекта включают упрощение процесса выбора, повышение информативности и создание удобного интерфейса. Сайт будет включать интеграцию с производителями, возможность пользователям делиться своими сборками и получать советы от экспертов.</w:t>
       </w:r>
     </w:p>
     <w:p>
@@ -898,12 +949,18 @@
           <w:ilvl w:val="0"/>
           <w:numId w:val="5"/>
         </w:numPr>
-        <w:rPr/>
-      </w:pPr>
-      <w:bookmarkStart w:id="2" w:name="__RefHeading___Toc864_3592309458"/>
-      <w:bookmarkEnd w:id="2"/>
-      <w:r>
-        <w:rPr/>
+        <w:spacing w:lineRule="auto" w:line="360"/>
+        <w:ind w:firstLine="709" w:left="0"/>
+        <w:rPr>
+          <w:rFonts w:ascii="Times New Roman" w:hAnsi="Times New Roman"/>
+        </w:rPr>
+      </w:pPr>
+      <w:bookmarkStart w:id="1" w:name="__RefHeading___Toc864_3592309458"/>
+      <w:bookmarkEnd w:id="1"/>
+      <w:r>
+        <w:rPr>
+          <w:rFonts w:ascii="Times New Roman" w:hAnsi="Times New Roman"/>
+        </w:rPr>
         <w:t>Введение</w:t>
       </w:r>
     </w:p>
@@ -914,15 +971,11 @@
           <w:ilvl w:val="0"/>
           <w:numId w:val="4"/>
         </w:numPr>
-        <w:pBdr/>
-        <w:spacing w:lineRule="auto" w:line="360" w:before="0" w:after="0"/>
-        <w:ind w:hanging="360" w:left="1210"/>
+        <w:spacing w:lineRule="auto" w:line="360" w:before="0" w:after="0"/>
+        <w:ind w:firstLine="709" w:left="0"/>
         <w:jc w:val="both"/>
         <w:rPr>
-          <w:rFonts w:ascii="Times New Roman" w:hAnsi="Times New Roman" w:eastAsia="Times New Roman" w:cs="Times New Roman"/>
-          <w:color w:val="000000"/>
-          <w:sz w:val="28"/>
-          <w:szCs w:val="28"/>
+          <w:rFonts w:ascii="Times New Roman" w:hAnsi="Times New Roman"/>
         </w:rPr>
       </w:pPr>
       <w:r>
@@ -937,7 +990,7 @@
       </w:r>
       <w:r>
         <w:rPr>
-          <w:rFonts w:eastAsia="Gungsuh" w:cs="Gungsuh" w:ascii="Gungsuh" w:hAnsi="Gungsuh"/>
+          <w:rFonts w:eastAsia="Gungsuh" w:cs="Gungsuh" w:ascii="Times New Roman" w:hAnsi="Times New Roman"/>
           <w:i/>
           <w:color w:val="000000"/>
           <w:sz w:val="28"/>
@@ -954,7 +1007,13 @@
           <w:sz w:val="28"/>
           <w:szCs w:val="28"/>
         </w:rPr>
-        <w:t xml:space="preserve">проекта </w:t>
+        <w:t>проекта Велосборщик включает в себя:</w:t>
+        <w:br/>
+        <w:t>1.</w:t>
+        <w:tab/>
+        <w:t>Велолюбители: люди, активно занимающиеся велоспортом или отдыхом на велосипеде, ищущие качественные и уникальные решения.</w:t>
+        <w:br/>
+        <w:t>2.</w:t>
       </w:r>
       <w:r>
         <w:rPr>
@@ -965,7 +1024,7 @@
           <w:sz w:val="28"/>
           <w:szCs w:val="28"/>
         </w:rPr>
-        <w:t>В</w:t>
+        <w:tab/>
       </w:r>
       <w:r>
         <w:rPr>
@@ -976,15 +1035,15 @@
           <w:sz w:val="28"/>
           <w:szCs w:val="28"/>
         </w:rPr>
-        <w:t>елосборщик включает в себя:</w:t>
+        <w:t>Новички: начинающие велосипедисты, желающие получить информацию для выбора подходящего велосипеда.</w:t>
         <w:br/>
-        <w:t>1. Велолюбители: люди, активно занимающиеся велоспортом или отдыхом на велосипеде, ищущие качественные и уникальные решения.</w:t>
+        <w:t>3.</w:t>
+        <w:tab/>
+        <w:t>Специалисты: механики и продавцы велотоваров, которым нужна платформа для доступа к различным компонентам и их характеристикам.</w:t>
         <w:br/>
-        <w:t>2. Новички: начинающие велосипедисты, желающие получить информацию для выбора подходящего велосипеда.</w:t>
-        <w:br/>
-        <w:t>3. Специалисты: механики и продавцы велотоваров, которым нужна платформа для доступа к различным компонентам и их характеристикам.</w:t>
-        <w:br/>
-        <w:t>4. Конструкторы: энтузиасты, интересующиеся сборкой индивидуально настроенных велосипедов для участия в соревнованиях или для личного использования.</w:t>
+        <w:t>4.</w:t>
+        <w:tab/>
+        <w:t>Конструкторы: энтузиасты, интересующиеся сборкой индивидуально настроенных велосипедов для участия в соревнованиях или для личного использования.</w:t>
       </w:r>
     </w:p>
     <w:p>
@@ -994,15 +1053,11 @@
           <w:ilvl w:val="0"/>
           <w:numId w:val="4"/>
         </w:numPr>
-        <w:pBdr/>
-        <w:spacing w:lineRule="auto" w:line="360" w:before="0" w:after="0"/>
-        <w:ind w:hanging="360" w:left="1210"/>
+        <w:spacing w:lineRule="auto" w:line="360" w:before="0" w:after="0"/>
+        <w:ind w:firstLine="709" w:left="0"/>
         <w:jc w:val="both"/>
         <w:rPr>
-          <w:rFonts w:ascii="Times New Roman" w:hAnsi="Times New Roman" w:eastAsia="Times New Roman" w:cs="Times New Roman"/>
-          <w:color w:val="000000"/>
-          <w:sz w:val="28"/>
-          <w:szCs w:val="28"/>
+          <w:rFonts w:ascii="Times New Roman" w:hAnsi="Times New Roman"/>
         </w:rPr>
       </w:pPr>
       <w:r>
@@ -1043,16 +1098,10 @@
           <w:ilvl w:val="0"/>
           <w:numId w:val="4"/>
         </w:numPr>
-        <w:pBdr/>
-        <w:spacing w:lineRule="auto" w:line="360" w:before="0" w:after="0"/>
-        <w:ind w:hanging="360" w:left="1210"/>
+        <w:spacing w:lineRule="auto" w:line="360" w:before="0" w:after="0"/>
+        <w:ind w:firstLine="709" w:left="0"/>
         <w:jc w:val="both"/>
-        <w:rPr>
-          <w:rFonts w:ascii="Times New Roman" w:hAnsi="Times New Roman" w:eastAsia="Times New Roman" w:cs="Times New Roman"/>
-          <w:color w:val="000000"/>
-          <w:sz w:val="28"/>
-          <w:szCs w:val="28"/>
-        </w:rPr>
+        <w:rPr/>
       </w:pPr>
       <w:r>
         <w:rPr>
@@ -1073,18 +1122,7 @@
           <w:sz w:val="28"/>
           <w:szCs w:val="28"/>
         </w:rPr>
-        <w:t xml:space="preserve">Проблема моего проекта — </w:t>
-      </w:r>
-      <w:r>
-        <w:rPr>
-          <w:rFonts w:eastAsia="Times New Roman" w:cs="Times New Roman" w:ascii="Times New Roman" w:hAnsi="Times New Roman"/>
-          <w:i w:val="false"/>
-          <w:iCs w:val="false"/>
-          <w:color w:val="000000"/>
-          <w:sz w:val="28"/>
-          <w:szCs w:val="28"/>
-        </w:rPr>
-        <w:t>отсутствие универсальных (и каких-либо русскоязычных) ресурсов для создания велосипедов любого уровня, ценника и класса, эта проблема касается таких слоёв населения, как велолюбители, начинающие велосипедисты и специалисты-конструкторы.</w:t>
+        <w:t>Проблема моего проекта — отсутствие универсальных (и каких-либо русскоязычных) ресурсов для создания велосипедов любого уровня, ценника и класса, эта проблема касается таких слоёв населения, как велолюбители, начинающие велосипедисты и специалисты-конструкторы.</w:t>
       </w:r>
     </w:p>
     <w:p>
@@ -1094,16 +1132,10 @@
           <w:ilvl w:val="0"/>
           <w:numId w:val="4"/>
         </w:numPr>
-        <w:pBdr/>
-        <w:spacing w:lineRule="auto" w:line="360" w:before="0" w:after="0"/>
-        <w:ind w:hanging="360" w:left="1210"/>
+        <w:spacing w:lineRule="auto" w:line="360" w:before="0" w:after="0"/>
+        <w:ind w:firstLine="709" w:left="0"/>
         <w:jc w:val="both"/>
-        <w:rPr>
-          <w:rFonts w:ascii="Times New Roman" w:hAnsi="Times New Roman" w:eastAsia="Times New Roman" w:cs="Times New Roman"/>
-          <w:color w:val="000000"/>
-          <w:sz w:val="28"/>
-          <w:szCs w:val="28"/>
-        </w:rPr>
+        <w:rPr/>
       </w:pPr>
       <w:r>
         <w:rPr>
@@ -1124,15 +1156,11 @@
           <w:ilvl w:val="0"/>
           <w:numId w:val="4"/>
         </w:numPr>
-        <w:pBdr/>
-        <w:spacing w:lineRule="auto" w:line="360" w:before="0" w:after="0"/>
-        <w:ind w:hanging="360" w:left="1210"/>
+        <w:spacing w:lineRule="auto" w:line="360" w:before="0" w:after="0"/>
+        <w:ind w:firstLine="709" w:left="0"/>
         <w:jc w:val="both"/>
         <w:rPr>
-          <w:rFonts w:ascii="Times New Roman" w:hAnsi="Times New Roman" w:eastAsia="Times New Roman" w:cs="Times New Roman"/>
-          <w:color w:val="000000"/>
-          <w:sz w:val="28"/>
-          <w:szCs w:val="28"/>
+          <w:rFonts w:ascii="Times New Roman" w:hAnsi="Times New Roman"/>
         </w:rPr>
       </w:pPr>
       <w:r>
@@ -1197,15 +1225,11 @@
           <w:ilvl w:val="0"/>
           <w:numId w:val="4"/>
         </w:numPr>
-        <w:pBdr/>
-        <w:spacing w:lineRule="auto" w:line="360" w:before="0" w:after="0"/>
-        <w:ind w:hanging="360" w:left="1210"/>
+        <w:spacing w:lineRule="auto" w:line="360" w:before="0" w:after="0"/>
+        <w:ind w:firstLine="709" w:left="0"/>
         <w:jc w:val="both"/>
         <w:rPr>
-          <w:rFonts w:ascii="Times New Roman" w:hAnsi="Times New Roman" w:eastAsia="Times New Roman" w:cs="Times New Roman"/>
-          <w:color w:val="000000"/>
-          <w:sz w:val="28"/>
-          <w:szCs w:val="28"/>
+          <w:rFonts w:ascii="Times New Roman" w:hAnsi="Times New Roman"/>
         </w:rPr>
       </w:pPr>
       <w:r>
@@ -1228,7 +1252,32 @@
           <w:sz w:val="28"/>
           <w:szCs w:val="28"/>
         </w:rPr>
-        <w:t xml:space="preserve">:  </w:t>
+        <w:t>:  Основная задача — создание интернет-ресурса (сайта) с вышеописанным функционалом.</w:t>
+      </w:r>
+    </w:p>
+    <w:p>
+      <w:pPr>
+        <w:pStyle w:val="Normal"/>
+        <w:numPr>
+          <w:ilvl w:val="0"/>
+          <w:numId w:val="4"/>
+        </w:numPr>
+        <w:spacing w:lineRule="auto" w:line="360" w:before="0" w:after="0"/>
+        <w:ind w:firstLine="709" w:left="0"/>
+        <w:jc w:val="both"/>
+        <w:rPr>
+          <w:rFonts w:ascii="Times New Roman" w:hAnsi="Times New Roman"/>
+        </w:rPr>
+      </w:pPr>
+      <w:r>
+        <w:rPr>
+          <w:rFonts w:eastAsia="Times New Roman" w:cs="Times New Roman" w:ascii="Times New Roman" w:hAnsi="Times New Roman"/>
+          <w:i/>
+          <w:color w:val="000000"/>
+          <w:sz w:val="28"/>
+          <w:szCs w:val="28"/>
+        </w:rPr>
+        <w:t>План работы</w:t>
       </w:r>
       <w:r>
         <w:rPr>
@@ -1239,76 +1288,33 @@
           <w:sz w:val="28"/>
           <w:szCs w:val="28"/>
         </w:rPr>
-        <w:t>Основная задача — создание интернет-ресурса (сайта) с вышеописанным функционалом</w:t>
-      </w:r>
-      <w:r>
-        <w:rPr>
-          <w:rFonts w:eastAsia="Times New Roman" w:cs="Times New Roman" w:ascii="Times New Roman" w:hAnsi="Times New Roman"/>
-          <w:i w:val="false"/>
-          <w:iCs w:val="false"/>
-          <w:color w:val="000000"/>
-          <w:sz w:val="28"/>
-          <w:szCs w:val="28"/>
-        </w:rPr>
-        <w:t>.</w:t>
-      </w:r>
-    </w:p>
-    <w:p>
-      <w:pPr>
-        <w:pStyle w:val="Normal"/>
-        <w:numPr>
-          <w:ilvl w:val="0"/>
-          <w:numId w:val="1"/>
-        </w:numPr>
-        <w:pBdr/>
-        <w:spacing w:lineRule="auto" w:line="360" w:before="0" w:after="0"/>
-        <w:ind w:hanging="425" w:left="1275"/>
-        <w:jc w:val="both"/>
-        <w:rPr/>
-      </w:pPr>
-      <w:r>
-        <w:rPr>
-          <w:rFonts w:eastAsia="Times New Roman" w:cs="Times New Roman" w:ascii="Times New Roman" w:hAnsi="Times New Roman"/>
-          <w:i/>
-          <w:color w:val="000000"/>
-          <w:sz w:val="28"/>
-          <w:szCs w:val="28"/>
-        </w:rPr>
-        <w:t>План работы</w:t>
-      </w:r>
-      <w:r>
-        <w:rPr>
-          <w:rFonts w:eastAsia="Times New Roman" w:cs="Times New Roman" w:ascii="Times New Roman" w:hAnsi="Times New Roman"/>
-          <w:i w:val="false"/>
-          <w:iCs w:val="false"/>
-          <w:color w:val="000000"/>
-          <w:sz w:val="28"/>
-          <w:szCs w:val="28"/>
-        </w:rPr>
         <w:t>:</w:t>
       </w:r>
     </w:p>
     <w:p>
       <w:pPr>
         <w:pStyle w:val="Normal"/>
-        <w:pBdr/>
         <w:spacing w:lineRule="auto" w:line="360" w:before="0" w:after="0"/>
         <w:ind w:hanging="0" w:left="1275"/>
         <w:jc w:val="both"/>
-        <w:rPr/>
-      </w:pPr>
-      <w:r>
-        <w:rPr/>
+        <w:rPr>
+          <w:rFonts w:ascii="Times New Roman" w:hAnsi="Times New Roman"/>
+        </w:rPr>
+      </w:pPr>
+      <w:r>
+        <w:rPr>
+          <w:rFonts w:ascii="Times New Roman" w:hAnsi="Times New Roman"/>
+        </w:rPr>
         <w:drawing>
           <wp:anchor behindDoc="0" distT="0" distB="0" distL="0" distR="0" simplePos="0" locked="0" layoutInCell="0" allowOverlap="1" relativeHeight="2">
             <wp:simplePos x="0" y="0"/>
             <wp:positionH relativeFrom="column">
-              <wp:posOffset>567055</wp:posOffset>
+              <wp:posOffset>21590</wp:posOffset>
             </wp:positionH>
             <wp:positionV relativeFrom="paragraph">
-              <wp:posOffset>-41275</wp:posOffset>
+              <wp:posOffset>635</wp:posOffset>
             </wp:positionV>
-            <wp:extent cx="5436235" cy="1421130"/>
+            <wp:extent cx="6268720" cy="2186940"/>
             <wp:effectExtent l="0" t="0" r="0" b="0"/>
             <wp:wrapSquare wrapText="largest"/>
             <wp:docPr id="1" name="Изображение1" descr=""/>
@@ -1333,7 +1339,7 @@
                   <pic:spPr bwMode="auto">
                     <a:xfrm>
                       <a:off x="0" y="0"/>
-                      <a:ext cx="5436235" cy="1421130"/>
+                      <a:ext cx="6268720" cy="2186940"/>
                     </a:xfrm>
                     <a:prstGeom prst="rect">
                       <a:avLst/>
@@ -1354,15 +1360,11 @@
           <w:ilvl w:val="0"/>
           <w:numId w:val="1"/>
         </w:numPr>
-        <w:pBdr/>
-        <w:spacing w:lineRule="auto" w:line="360" w:before="0" w:after="0"/>
-        <w:ind w:hanging="425" w:left="1275"/>
+        <w:spacing w:lineRule="auto" w:line="360" w:before="0" w:after="0"/>
+        <w:ind w:firstLine="709" w:left="0"/>
         <w:jc w:val="both"/>
         <w:rPr>
-          <w:rFonts w:ascii="Times New Roman" w:hAnsi="Times New Roman" w:eastAsia="Times New Roman" w:cs="Times New Roman"/>
-          <w:color w:val="000000"/>
-          <w:sz w:val="28"/>
-          <w:szCs w:val="28"/>
+          <w:rFonts w:ascii="Times New Roman" w:hAnsi="Times New Roman"/>
         </w:rPr>
       </w:pPr>
       <w:r>
@@ -1395,7 +1397,8 @@
           <w:r>
             <w:rPr>
               <w:rFonts w:eastAsia="Times New Roman" w:cs="Times New Roman" w:ascii="Times New Roman" w:hAnsi="Times New Roman"/>
-              <w:i/>
+              <w:i w:val="false"/>
+              <w:iCs w:val="false"/>
               <w:color w:val="000000"/>
               <w:sz w:val="28"/>
               <w:szCs w:val="28"/>
@@ -1403,7 +1406,9 @@
           </w:r>
           <w:r>
             <w:rPr>
-              <w:rFonts w:eastAsia="Gungsuh" w:cs="Gungsuh" w:ascii="Gungsuh" w:hAnsi="Gungsuh"/>
+              <w:rFonts w:eastAsia="Times New Roman" w:cs="Times New Roman" w:ascii="Times New Roman" w:hAnsi="Times New Roman"/>
+              <w:i w:val="false"/>
+              <w:iCs w:val="false"/>
               <w:color w:val="000000"/>
               <w:sz w:val="28"/>
               <w:szCs w:val="28"/>
@@ -1428,16 +1433,10 @@
           <w:ilvl w:val="0"/>
           <w:numId w:val="1"/>
         </w:numPr>
-        <w:pBdr/>
-        <w:spacing w:lineRule="auto" w:line="360" w:before="0" w:after="0"/>
-        <w:ind w:hanging="425" w:left="1275"/>
+        <w:spacing w:lineRule="auto" w:line="360" w:before="0" w:after="0"/>
+        <w:ind w:firstLine="709" w:left="0"/>
         <w:jc w:val="both"/>
-        <w:rPr>
-          <w:rFonts w:ascii="Times New Roman" w:hAnsi="Times New Roman" w:eastAsia="Times New Roman" w:cs="Times New Roman"/>
-          <w:color w:val="000000"/>
-          <w:sz w:val="28"/>
-          <w:szCs w:val="28"/>
-        </w:rPr>
+        <w:rPr/>
       </w:pPr>
       <w:r>
         <w:rPr>
@@ -1487,7 +1486,7 @@
           <w:szCs w:val="28"/>
           <w:lang w:val="ru-RU"/>
         </w:rPr>
-        <w:t>серверов, изучение библиотек, связанных с этой частью проекта, также заполнение БД.</w:t>
+        <w:t>серверов, изучение библиотек, связанных с этой частью проекта, также заполнение БД</w:t>
       </w:r>
     </w:p>
     <w:p>
@@ -1497,25 +1496,43 @@
           <w:ilvl w:val="0"/>
           <w:numId w:val="1"/>
         </w:numPr>
-        <w:pBdr/>
-        <w:spacing w:lineRule="auto" w:line="360" w:before="0" w:after="0"/>
-        <w:ind w:hanging="425" w:left="1275"/>
+        <w:spacing w:lineRule="auto" w:line="360" w:before="0" w:after="0"/>
+        <w:ind w:firstLine="709" w:left="0"/>
         <w:jc w:val="both"/>
         <w:rPr>
-          <w:rFonts w:ascii="Avenir" w:hAnsi="Avenir" w:eastAsia="Avenir" w:cs="Avenir"/>
-          <w:color w:val="000000"/>
-          <w:sz w:val="28"/>
-          <w:szCs w:val="28"/>
-        </w:rPr>
-      </w:pPr>
-      <w:r>
-        <w:rPr>
-          <w:rFonts w:eastAsia="Times New Roman" w:cs="Times New Roman" w:ascii="Times New Roman" w:hAnsi="Times New Roman"/>
-          <w:color w:val="000000"/>
-          <w:sz w:val="28"/>
-          <w:szCs w:val="28"/>
-        </w:rPr>
-        <w:t xml:space="preserve">В этом проекте я научился работе с </w:t>
+          <w:rFonts w:ascii="Times New Roman" w:hAnsi="Times New Roman"/>
+        </w:rPr>
+      </w:pPr>
+      <w:r>
+        <w:rPr>
+          <w:rFonts w:eastAsia="Times New Roman" w:cs="Times New Roman" w:ascii="Times New Roman" w:hAnsi="Times New Roman"/>
+          <w:i/>
+          <w:iCs/>
+          <w:color w:val="000000"/>
+          <w:sz w:val="28"/>
+          <w:szCs w:val="28"/>
+        </w:rPr>
+        <w:t>Полученные знания</w:t>
+      </w:r>
+      <w:r>
+        <w:rPr>
+          <w:rFonts w:eastAsia="Times New Roman" w:cs="Times New Roman" w:ascii="Times New Roman" w:hAnsi="Times New Roman"/>
+          <w:i w:val="false"/>
+          <w:iCs w:val="false"/>
+          <w:color w:val="000000"/>
+          <w:sz w:val="28"/>
+          <w:szCs w:val="28"/>
+        </w:rPr>
+        <w:t>: В</w:t>
+      </w:r>
+      <w:r>
+        <w:rPr>
+          <w:rFonts w:eastAsia="Times New Roman" w:cs="Times New Roman" w:ascii="Times New Roman" w:hAnsi="Times New Roman"/>
+          <w:color w:val="000000"/>
+          <w:sz w:val="28"/>
+          <w:szCs w:val="28"/>
+        </w:rPr>
+        <w:t xml:space="preserve"> этом проекте я научился работе с </w:t>
       </w:r>
       <w:r>
         <w:rPr>
@@ -1615,16 +1632,40 @@
           <w:szCs w:val="28"/>
           <w:lang w:val="ru-RU"/>
         </w:rPr>
-        <w:t>для улучшения внешнего вида сайта.</w:t>
-      </w:r>
-    </w:p>
-    <w:p>
-      <w:pPr>
-        <w:pStyle w:val="Normal"/>
-        <w:rPr/>
-      </w:pPr>
-      <w:r>
-        <w:rPr/>
+        <w:t xml:space="preserve">для улучшения внешнего вида сайта, а также работе с </w:t>
+      </w:r>
+      <w:r>
+        <w:rPr>
+          <w:rFonts w:eastAsia="Times New Roman" w:cs="Times New Roman" w:ascii="Times New Roman" w:hAnsi="Times New Roman"/>
+          <w:color w:val="000000"/>
+          <w:sz w:val="28"/>
+          <w:szCs w:val="28"/>
+          <w:lang w:val="en-US"/>
+        </w:rPr>
+        <w:t>ORM SQLalchemy</w:t>
+      </w:r>
+      <w:r>
+        <w:rPr>
+          <w:rFonts w:eastAsia="Times New Roman" w:cs="Times New Roman" w:ascii="Times New Roman" w:hAnsi="Times New Roman"/>
+          <w:color w:val="000000"/>
+          <w:sz w:val="28"/>
+          <w:szCs w:val="28"/>
+          <w:lang w:val="ru-RU"/>
+        </w:rPr>
+        <w:t>.</w:t>
+      </w:r>
+    </w:p>
+    <w:p>
+      <w:pPr>
+        <w:pStyle w:val="Normal"/>
+        <w:rPr>
+          <w:rFonts w:ascii="Times New Roman" w:hAnsi="Times New Roman"/>
+        </w:rPr>
+      </w:pPr>
+      <w:r>
+        <w:rPr>
+          <w:rFonts w:ascii="Times New Roman" w:hAnsi="Times New Roman"/>
+        </w:rPr>
       </w:r>
     </w:p>
     <w:p>
@@ -1634,12 +1675,18 @@
           <w:ilvl w:val="0"/>
           <w:numId w:val="5"/>
         </w:numPr>
-        <w:rPr/>
-      </w:pPr>
-      <w:bookmarkStart w:id="3" w:name="__RefHeading___Toc866_3592309458"/>
-      <w:bookmarkEnd w:id="3"/>
-      <w:r>
-        <w:rPr/>
+        <w:spacing w:lineRule="auto" w:line="360" w:before="0" w:after="0"/>
+        <w:ind w:firstLine="709" w:left="0"/>
+        <w:rPr>
+          <w:rFonts w:ascii="Times New Roman" w:hAnsi="Times New Roman"/>
+        </w:rPr>
+      </w:pPr>
+      <w:bookmarkStart w:id="2" w:name="__RefHeading___Toc866_3592309458"/>
+      <w:bookmarkEnd w:id="2"/>
+      <w:r>
+        <w:rPr>
+          <w:rFonts w:ascii="Times New Roman" w:hAnsi="Times New Roman"/>
+        </w:rPr>
         <w:t xml:space="preserve">Теоретическая часть. </w:t>
       </w:r>
     </w:p>
@@ -1650,14 +1697,11 @@
           <w:ilvl w:val="0"/>
           <w:numId w:val="2"/>
         </w:numPr>
-        <w:pBdr/>
-        <w:spacing w:lineRule="auto" w:line="360" w:before="0" w:after="0"/>
+        <w:spacing w:lineRule="auto" w:line="360" w:before="0" w:after="0"/>
+        <w:ind w:firstLine="709" w:left="0"/>
         <w:jc w:val="both"/>
         <w:rPr>
-          <w:rFonts w:ascii="Times New Roman" w:hAnsi="Times New Roman" w:eastAsia="Times New Roman" w:cs="Times New Roman"/>
-          <w:color w:val="000000"/>
-          <w:sz w:val="28"/>
-          <w:szCs w:val="28"/>
+          <w:rFonts w:ascii="Times New Roman" w:hAnsi="Times New Roman"/>
         </w:rPr>
       </w:pPr>
       <w:r>
@@ -1677,16 +1721,7 @@
           <w:sz w:val="28"/>
           <w:szCs w:val="28"/>
         </w:rPr>
-        <w:t xml:space="preserve"> — </w:t>
-      </w:r>
-      <w:r>
-        <w:rPr>
-          <w:rFonts w:eastAsia="Times New Roman" w:cs="Times New Roman" w:ascii="Times New Roman" w:hAnsi="Times New Roman"/>
-          <w:color w:val="000000"/>
-          <w:sz w:val="28"/>
-          <w:szCs w:val="28"/>
-        </w:rPr>
-        <w:t xml:space="preserve">В ходе исследования я нашёл 4 подобных сайта: </w:t>
+        <w:t xml:space="preserve"> — В ходе исследования я нашёл 4 подобных сайта: </w:t>
       </w:r>
     </w:p>
     <w:p>
@@ -1696,25 +1731,19 @@
           <w:ilvl w:val="0"/>
           <w:numId w:val="0"/>
         </w:numPr>
-        <w:pBdr/>
-        <w:spacing w:lineRule="auto" w:line="360" w:before="0" w:after="0"/>
-        <w:ind w:hanging="0" w:left="1287"/>
+        <w:spacing w:lineRule="auto" w:line="360" w:before="0" w:after="0"/>
+        <w:ind w:firstLine="709" w:left="0"/>
         <w:jc w:val="both"/>
-        <w:rPr>
-          <w:rFonts w:ascii="Times New Roman" w:hAnsi="Times New Roman" w:eastAsia="Times New Roman" w:cs="Times New Roman"/>
-          <w:color w:val="000000"/>
-          <w:sz w:val="28"/>
-          <w:szCs w:val="28"/>
-        </w:rPr>
-      </w:pPr>
-      <w:r>
-        <w:rPr>
-          <w:rFonts w:eastAsia="Times New Roman" w:cs="Times New Roman" w:ascii="Times New Roman" w:hAnsi="Times New Roman"/>
-          <w:color w:val="000000"/>
-          <w:sz w:val="28"/>
-          <w:szCs w:val="28"/>
-        </w:rPr>
-        <w:t>1.</w:t>
+        <w:rPr/>
+      </w:pPr>
+      <w:r>
+        <w:rPr>
+          <w:rFonts w:eastAsia="Times New Roman" w:cs="Times New Roman" w:ascii="Times New Roman" w:hAnsi="Times New Roman"/>
+          <w:color w:val="000000"/>
+          <w:sz w:val="28"/>
+          <w:szCs w:val="28"/>
+        </w:rPr>
+        <w:t xml:space="preserve">1. </w:t>
       </w:r>
       <w:hyperlink r:id="rId3">
         <w:r>
@@ -1765,16 +1794,10 @@
           <w:ilvl w:val="0"/>
           <w:numId w:val="0"/>
         </w:numPr>
-        <w:pBdr/>
-        <w:spacing w:lineRule="auto" w:line="360" w:before="0" w:after="0"/>
-        <w:ind w:hanging="0" w:left="1287"/>
+        <w:spacing w:lineRule="auto" w:line="360" w:before="0" w:after="0"/>
+        <w:ind w:firstLine="709" w:left="0"/>
         <w:jc w:val="both"/>
-        <w:rPr>
-          <w:rFonts w:ascii="Times New Roman" w:hAnsi="Times New Roman" w:eastAsia="Times New Roman" w:cs="Times New Roman"/>
-          <w:color w:val="000000"/>
-          <w:sz w:val="28"/>
-          <w:szCs w:val="28"/>
-        </w:rPr>
+        <w:rPr/>
       </w:pPr>
       <w:r>
         <w:rPr>
@@ -1814,16 +1837,10 @@
           <w:ilvl w:val="0"/>
           <w:numId w:val="0"/>
         </w:numPr>
-        <w:pBdr/>
-        <w:spacing w:lineRule="auto" w:line="360" w:before="0" w:after="0"/>
-        <w:ind w:hanging="0" w:left="1287"/>
+        <w:spacing w:lineRule="auto" w:line="360" w:before="0" w:after="0"/>
+        <w:ind w:firstLine="709" w:left="0"/>
         <w:jc w:val="both"/>
-        <w:rPr>
-          <w:rFonts w:ascii="Times New Roman" w:hAnsi="Times New Roman" w:eastAsia="Times New Roman" w:cs="Times New Roman"/>
-          <w:color w:val="000000"/>
-          <w:sz w:val="28"/>
-          <w:szCs w:val="28"/>
-        </w:rPr>
+        <w:rPr/>
       </w:pPr>
       <w:r>
         <w:rPr>
@@ -1863,16 +1880,10 @@
           <w:ilvl w:val="0"/>
           <w:numId w:val="0"/>
         </w:numPr>
-        <w:pBdr/>
-        <w:spacing w:lineRule="auto" w:line="360" w:before="0" w:after="0"/>
-        <w:ind w:hanging="0" w:left="1287"/>
+        <w:spacing w:lineRule="auto" w:line="360" w:before="0" w:after="0"/>
+        <w:ind w:firstLine="709" w:left="0"/>
         <w:jc w:val="both"/>
-        <w:rPr>
-          <w:rFonts w:ascii="Times New Roman" w:hAnsi="Times New Roman" w:eastAsia="Times New Roman" w:cs="Times New Roman"/>
-          <w:color w:val="000000"/>
-          <w:sz w:val="28"/>
-          <w:szCs w:val="28"/>
-        </w:rPr>
+        <w:rPr/>
       </w:pPr>
       <w:r>
         <w:rPr>
@@ -1902,16 +1913,7 @@
           <w:sz w:val="28"/>
           <w:szCs w:val="28"/>
         </w:rPr>
-        <w:t xml:space="preserve"> — </w:t>
-      </w:r>
-      <w:r>
-        <w:rPr>
-          <w:rFonts w:eastAsia="Times New Roman" w:cs="Times New Roman" w:ascii="Times New Roman" w:hAnsi="Times New Roman"/>
-          <w:color w:val="000000"/>
-          <w:sz w:val="28"/>
-          <w:szCs w:val="28"/>
-        </w:rPr>
-        <w:t>сайт для создания дизайна велосипеда, однако ничего, кроме вида его раскраски, изменять не предполагается</w:t>
+        <w:t xml:space="preserve"> — сайт для создания дизайна велосипеда, однако ничего, кроме вида его раскраски, изменять не предполагается</w:t>
       </w:r>
     </w:p>
     <w:p>
@@ -1921,25 +1923,75 @@
           <w:ilvl w:val="0"/>
           <w:numId w:val="0"/>
         </w:numPr>
-        <w:pBdr/>
-        <w:spacing w:lineRule="auto" w:line="360" w:before="0" w:after="0"/>
-        <w:ind w:hanging="0" w:left="1287"/>
+        <w:spacing w:lineRule="auto" w:line="360" w:before="0" w:after="0"/>
+        <w:ind w:firstLine="709" w:left="0"/>
         <w:jc w:val="both"/>
         <w:rPr>
-          <w:rFonts w:ascii="Times New Roman" w:hAnsi="Times New Roman" w:eastAsia="Times New Roman" w:cs="Times New Roman"/>
-          <w:color w:val="000000"/>
-          <w:sz w:val="28"/>
-          <w:szCs w:val="28"/>
-        </w:rPr>
-      </w:pPr>
-      <w:r>
-        <w:rPr>
-          <w:rFonts w:eastAsia="Times New Roman" w:cs="Times New Roman" w:ascii="Times New Roman" w:hAnsi="Times New Roman"/>
-          <w:color w:val="000000"/>
-          <w:sz w:val="28"/>
-          <w:szCs w:val="28"/>
-        </w:rPr>
-        <w:t>Также, у каждого из вышеперечисленных сайтов отсутствует русский язык и каждый из интернет-магазинов, представляющих эти сайты, дислоцируется в Северной Америке (США или Канада), что исключает возможность заказа собранного велосипеда без дополнительных комиссий, наценок и тп в РФ.</w:t>
+          <w:rFonts w:ascii="Times New Roman" w:hAnsi="Times New Roman"/>
+        </w:rPr>
+      </w:pPr>
+      <w:r>
+        <w:rPr>
+          <w:rFonts w:eastAsia="Times New Roman" w:cs="Times New Roman" w:ascii="Times New Roman" w:hAnsi="Times New Roman"/>
+          <w:color w:val="000000"/>
+          <w:sz w:val="28"/>
+          <w:szCs w:val="28"/>
+        </w:rPr>
+        <w:t xml:space="preserve">Также, у каждого из вышеперечисленных сайтов отсутствует русский язык и каждый из интернет-магазинов, представляющих эти сайты, дислоцируется в Северной Америке </w:t>
+      </w:r>
+      <w:r>
+        <w:rPr>
+          <w:rFonts w:eastAsia="Times New Roman" w:cs="Times New Roman" w:ascii="Times New Roman" w:hAnsi="Times New Roman"/>
+          <w:color w:val="000000"/>
+          <w:sz w:val="28"/>
+          <w:szCs w:val="28"/>
+        </w:rPr>
+        <w:t>или Европе</w:t>
+      </w:r>
+      <w:r>
+        <w:rPr>
+          <w:rFonts w:eastAsia="Times New Roman" w:cs="Times New Roman" w:ascii="Times New Roman" w:hAnsi="Times New Roman"/>
+          <w:color w:val="000000"/>
+          <w:sz w:val="28"/>
+          <w:szCs w:val="28"/>
+        </w:rPr>
+        <w:t xml:space="preserve"> (США, </w:t>
+      </w:r>
+      <w:r>
+        <w:rPr>
+          <w:rFonts w:eastAsia="Times New Roman" w:cs="Times New Roman" w:ascii="Times New Roman" w:hAnsi="Times New Roman"/>
+          <w:color w:val="000000"/>
+          <w:sz w:val="28"/>
+          <w:szCs w:val="28"/>
+        </w:rPr>
+        <w:t>Италия и Германия</w:t>
+      </w:r>
+      <w:r>
+        <w:rPr>
+          <w:rFonts w:eastAsia="Times New Roman" w:cs="Times New Roman" w:ascii="Times New Roman" w:hAnsi="Times New Roman"/>
+          <w:color w:val="000000"/>
+          <w:sz w:val="28"/>
+          <w:szCs w:val="28"/>
+        </w:rPr>
+        <w:t xml:space="preserve">), что исключает возможность заказа собранного велосипеда без дополнительных комиссий, наценок </w:t>
+      </w:r>
+      <w:r>
+        <w:rPr>
+          <w:rFonts w:eastAsia="Times New Roman" w:cs="Times New Roman" w:ascii="Times New Roman" w:hAnsi="Times New Roman"/>
+          <w:color w:val="000000"/>
+          <w:sz w:val="28"/>
+          <w:szCs w:val="28"/>
+        </w:rPr>
+        <w:t xml:space="preserve">и т. п. </w:t>
+      </w:r>
+      <w:r>
+        <w:rPr>
+          <w:rFonts w:eastAsia="Times New Roman" w:cs="Times New Roman" w:ascii="Times New Roman" w:hAnsi="Times New Roman"/>
+          <w:color w:val="000000"/>
+          <w:sz w:val="28"/>
+          <w:szCs w:val="28"/>
+        </w:rPr>
+        <w:t>в РФ.</w:t>
       </w:r>
     </w:p>
     <w:p>
@@ -1949,15 +2001,10 @@
           <w:ilvl w:val="0"/>
           <w:numId w:val="2"/>
         </w:numPr>
-        <w:pBdr/>
-        <w:spacing w:lineRule="auto" w:line="360" w:before="0" w:after="0"/>
+        <w:spacing w:lineRule="auto" w:line="360" w:before="0" w:after="0"/>
+        <w:ind w:firstLine="709" w:left="0"/>
         <w:jc w:val="both"/>
-        <w:rPr>
-          <w:rFonts w:ascii="Times New Roman" w:hAnsi="Times New Roman" w:eastAsia="Times New Roman" w:cs="Times New Roman"/>
-          <w:color w:val="000000"/>
-          <w:sz w:val="28"/>
-          <w:szCs w:val="28"/>
-        </w:rPr>
+        <w:rPr/>
       </w:pPr>
       <w:r>
         <w:rPr>
@@ -2046,48 +2093,12 @@
           <w:szCs w:val="28"/>
           <w:lang w:val="ru-RU"/>
         </w:rPr>
-        <w:t xml:space="preserve">Все шаблоны страниц сайта </w:t>
-      </w:r>
-      <w:r>
-        <w:rPr>
-          <w:rFonts w:eastAsia="Times New Roman" w:cs="Times New Roman" w:ascii="Times New Roman" w:hAnsi="Times New Roman"/>
-          <w:i w:val="false"/>
-          <w:iCs w:val="false"/>
-          <w:color w:val="000000"/>
-          <w:sz w:val="28"/>
-          <w:szCs w:val="28"/>
-          <w:lang w:val="ru-RU"/>
-        </w:rPr>
-        <w:t>делал</w:t>
-      </w:r>
-      <w:r>
-        <w:rPr>
-          <w:rFonts w:eastAsia="Times New Roman" w:cs="Times New Roman" w:ascii="Times New Roman" w:hAnsi="Times New Roman"/>
-          <w:i w:val="false"/>
-          <w:iCs w:val="false"/>
-          <w:color w:val="000000"/>
-          <w:sz w:val="28"/>
-          <w:szCs w:val="28"/>
-          <w:lang w:val="ru-RU"/>
-        </w:rPr>
-        <w:t>ись</w:t>
-      </w:r>
-      <w:r>
-        <w:rPr>
-          <w:rFonts w:eastAsia="Times New Roman" w:cs="Times New Roman" w:ascii="Times New Roman" w:hAnsi="Times New Roman"/>
-          <w:i w:val="false"/>
-          <w:iCs w:val="false"/>
-          <w:color w:val="000000"/>
-          <w:sz w:val="28"/>
-          <w:szCs w:val="28"/>
-          <w:lang w:val="ru-RU"/>
-        </w:rPr>
-        <w:t xml:space="preserve"> на</w:t>
+        <w:t>Все шаблоны страниц сайта делались на</w:t>
       </w:r>
       <w:r>
         <w:rPr>
           <w:rStyle w:val="Strong"/>
-          <w:rFonts w:eastAsia="Times New Roman" w:cs="Times New Roman" w:ascii="YS Text;apple-system;BlinkMacSystemFont;Arial;Helvetica;sans-serif" w:hAnsi="YS Text;apple-system;BlinkMacSystemFont;Arial;Helvetica;sans-serif"/>
+          <w:rFonts w:eastAsia="Times New Roman" w:cs="Times New Roman" w:ascii="Times New Roman" w:hAnsi="Times New Roman"/>
           <w:b w:val="false"/>
           <w:i w:val="false"/>
           <w:iCs w:val="false"/>
@@ -2104,7 +2115,7 @@
       <w:r>
         <w:rPr>
           <w:rStyle w:val="Strong"/>
-          <w:rFonts w:eastAsia="Times New Roman" w:cs="Times New Roman" w:ascii="YS Text;apple-system;BlinkMacSystemFont;Arial;Helvetica;sans-serif" w:hAnsi="YS Text;apple-system;BlinkMacSystemFont;Arial;Helvetica;sans-serif"/>
+          <w:rFonts w:eastAsia="Times New Roman" w:cs="Times New Roman" w:ascii="Times New Roman" w:hAnsi="Times New Roman"/>
           <w:b w:val="false"/>
           <w:i w:val="false"/>
           <w:iCs w:val="false"/>
@@ -2150,7 +2161,7 @@
           <w:szCs w:val="28"/>
           <w:lang w:val="ru-RU"/>
         </w:rPr>
-        <w:t xml:space="preserve">языке </w:t>
+        <w:t xml:space="preserve">языке гипертекстовой разметки для структурирования и оформления с использованием классов </w:t>
       </w:r>
       <w:r>
         <w:rPr>
@@ -2165,9 +2176,9 @@
           <w:spacing w:val="0"/>
           <w:sz w:val="28"/>
           <w:szCs w:val="28"/>
-          <w:lang w:val="ru-RU"/>
-        </w:rPr>
-        <w:t>гипертекстовой разметки</w:t>
+          <w:lang w:val="en-US"/>
+        </w:rPr>
+        <w:t xml:space="preserve">Bootstrap, </w:t>
       </w:r>
       <w:r>
         <w:rPr>
@@ -2184,7 +2195,7 @@
           <w:szCs w:val="28"/>
           <w:lang w:val="ru-RU"/>
         </w:rPr>
-        <w:t xml:space="preserve"> для структурирования и оформления </w:t>
+        <w:t xml:space="preserve">для динамичности сайта использовался язык </w:t>
       </w:r>
       <w:r>
         <w:rPr>
@@ -2199,9 +2210,535 @@
           <w:spacing w:val="0"/>
           <w:sz w:val="28"/>
           <w:szCs w:val="28"/>
+          <w:lang w:val="en-US"/>
+        </w:rPr>
+        <w:t>JavaScript</w:t>
+      </w:r>
+      <w:r>
+        <w:rPr>
+          <w:rFonts w:eastAsia="Times New Roman" w:cs="Times New Roman" w:ascii="Times New Roman" w:hAnsi="Times New Roman"/>
+          <w:color w:val="000000"/>
+          <w:sz w:val="28"/>
+          <w:szCs w:val="28"/>
+        </w:rPr>
+        <w:t>. Работа с БД выполнялась через библиотеку</w:t>
+      </w:r>
+      <w:r>
+        <w:rPr>
+          <w:rFonts w:eastAsia="Times New Roman" w:cs="Times New Roman" w:ascii="Times New Roman" w:hAnsi="Times New Roman"/>
+          <w:color w:val="000000"/>
+          <w:sz w:val="28"/>
+          <w:szCs w:val="28"/>
+          <w:lang w:val="en-US"/>
+        </w:rPr>
+        <w:t xml:space="preserve"> ORM sqlalchemy, </w:t>
+      </w:r>
+      <w:r>
+        <w:rPr>
+          <w:rFonts w:eastAsia="Times New Roman" w:cs="Times New Roman" w:ascii="Times New Roman" w:hAnsi="Times New Roman"/>
+          <w:color w:val="000000"/>
+          <w:sz w:val="28"/>
+          <w:szCs w:val="28"/>
           <w:lang w:val="ru-RU"/>
         </w:rPr>
-        <w:t xml:space="preserve">с использованием классов </w:t>
+        <w:t xml:space="preserve">сама база данных — </w:t>
+      </w:r>
+      <w:r>
+        <w:rPr>
+          <w:rFonts w:eastAsia="Times New Roman" w:cs="Times New Roman" w:ascii="Times New Roman" w:hAnsi="Times New Roman"/>
+          <w:color w:val="000000"/>
+          <w:sz w:val="28"/>
+          <w:szCs w:val="28"/>
+          <w:lang w:val="en-US"/>
+        </w:rPr>
+        <w:t>SqlLite</w:t>
+      </w:r>
+      <w:r>
+        <w:rPr>
+          <w:rFonts w:eastAsia="Times New Roman" w:cs="Times New Roman" w:ascii="Times New Roman" w:hAnsi="Times New Roman"/>
+          <w:color w:val="000000"/>
+          <w:sz w:val="28"/>
+          <w:szCs w:val="28"/>
+        </w:rPr>
+        <w:t>.</w:t>
+      </w:r>
+    </w:p>
+    <w:p>
+      <w:pPr>
+        <w:pStyle w:val="Normal"/>
+        <w:numPr>
+          <w:ilvl w:val="0"/>
+          <w:numId w:val="2"/>
+        </w:numPr>
+        <w:spacing w:lineRule="auto" w:line="360" w:before="0" w:after="0"/>
+        <w:ind w:firstLine="709" w:left="0"/>
+        <w:jc w:val="both"/>
+        <w:rPr>
+          <w:rFonts w:ascii="Times New Roman" w:hAnsi="Times New Roman"/>
+        </w:rPr>
+      </w:pPr>
+      <w:r>
+        <w:rPr>
+          <w:rFonts w:eastAsia="Times New Roman" w:cs="Times New Roman" w:ascii="Times New Roman" w:hAnsi="Times New Roman"/>
+          <w:i/>
+          <w:color w:val="000000"/>
+          <w:sz w:val="28"/>
+          <w:szCs w:val="28"/>
+        </w:rPr>
+        <w:t>Функциональность</w:t>
+      </w:r>
+      <w:r>
+        <w:rPr>
+          <w:rFonts w:eastAsia="Times New Roman" w:cs="Times New Roman" w:ascii="Times New Roman" w:hAnsi="Times New Roman"/>
+          <w:i w:val="false"/>
+          <w:iCs w:val="false"/>
+          <w:color w:val="000000"/>
+          <w:sz w:val="28"/>
+          <w:szCs w:val="28"/>
+        </w:rPr>
+        <w:t>: возможность добавления или удаления деталей, сборок со стороны администрации сайта</w:t>
+      </w:r>
+      <w:r>
+        <w:rPr>
+          <w:rFonts w:eastAsia="Times New Roman" w:cs="Times New Roman" w:ascii="Times New Roman" w:hAnsi="Times New Roman"/>
+          <w:color w:val="000000"/>
+          <w:sz w:val="28"/>
+          <w:szCs w:val="28"/>
+        </w:rPr>
+        <w:t>.</w:t>
+      </w:r>
+    </w:p>
+    <w:p>
+      <w:pPr>
+        <w:pStyle w:val="Normal"/>
+        <w:numPr>
+          <w:ilvl w:val="0"/>
+          <w:numId w:val="2"/>
+        </w:numPr>
+        <w:spacing w:lineRule="auto" w:line="360" w:before="0" w:after="0"/>
+        <w:ind w:firstLine="709" w:left="0"/>
+        <w:jc w:val="both"/>
+        <w:rPr/>
+      </w:pPr>
+      <w:r>
+        <w:rPr>
+          <w:rFonts w:eastAsia="Times New Roman" w:cs="Times New Roman" w:ascii="Times New Roman" w:hAnsi="Times New Roman"/>
+          <w:i/>
+          <w:color w:val="000000"/>
+          <w:sz w:val="28"/>
+          <w:szCs w:val="28"/>
+        </w:rPr>
+        <w:t>Дизайн</w:t>
+      </w:r>
+      <w:r>
+        <w:rPr>
+          <w:rFonts w:eastAsia="Times New Roman" w:cs="Times New Roman" w:ascii="Times New Roman" w:hAnsi="Times New Roman"/>
+          <w:i w:val="false"/>
+          <w:iCs w:val="false"/>
+          <w:color w:val="000000"/>
+          <w:sz w:val="28"/>
+          <w:szCs w:val="28"/>
+        </w:rPr>
+        <w:t>:</w:t>
+      </w:r>
+      <w:r>
+        <w:rPr>
+          <w:rFonts w:eastAsia="Times New Roman" w:cs="Times New Roman" w:ascii="Times New Roman" w:hAnsi="Times New Roman"/>
+          <w:i/>
+          <w:color w:val="000000"/>
+          <w:sz w:val="28"/>
+          <w:szCs w:val="28"/>
+        </w:rPr>
+        <w:t xml:space="preserve"> </w:t>
+      </w:r>
+      <w:r>
+        <w:rPr>
+          <w:rStyle w:val="Strong"/>
+          <w:rFonts w:eastAsia="Times New Roman" w:cs="Times New Roman" w:ascii="Times New Roman" w:hAnsi="Times New Roman"/>
+          <w:b w:val="false"/>
+          <w:i w:val="false"/>
+          <w:caps w:val="false"/>
+          <w:smallCaps w:val="false"/>
+          <w:color w:val="000000"/>
+          <w:spacing w:val="0"/>
+          <w:sz w:val="28"/>
+          <w:szCs w:val="28"/>
+        </w:rPr>
+        <w:t xml:space="preserve">Дизайн сайта делался с использованием классов </w:t>
+      </w:r>
+      <w:r>
+        <w:rPr>
+          <w:rStyle w:val="Strong"/>
+          <w:rFonts w:eastAsia="Times New Roman" w:cs="Times New Roman" w:ascii="Times New Roman" w:hAnsi="Times New Roman"/>
+          <w:b w:val="false"/>
+          <w:i w:val="false"/>
+          <w:caps w:val="false"/>
+          <w:smallCaps w:val="false"/>
+          <w:color w:val="000000"/>
+          <w:spacing w:val="0"/>
+          <w:sz w:val="28"/>
+          <w:szCs w:val="28"/>
+          <w:lang w:val="en-US"/>
+        </w:rPr>
+        <w:t>Bootstrap</w:t>
+      </w:r>
+      <w:r>
+        <w:rPr>
+          <w:rStyle w:val="Strong"/>
+          <w:rFonts w:eastAsia="Times New Roman" w:cs="Times New Roman" w:ascii="Times New Roman" w:hAnsi="Times New Roman"/>
+          <w:b w:val="false"/>
+          <w:i w:val="false"/>
+          <w:caps w:val="false"/>
+          <w:smallCaps w:val="false"/>
+          <w:color w:val="000000"/>
+          <w:spacing w:val="0"/>
+          <w:sz w:val="28"/>
+          <w:szCs w:val="28"/>
+          <w:lang w:val="ru-RU"/>
+        </w:rPr>
+        <w:t xml:space="preserve"> для улучшения читаемости и внешнего вида</w:t>
+      </w:r>
+      <w:r>
+        <w:rPr>
+          <w:rFonts w:eastAsia="Times New Roman" w:cs="Times New Roman" w:ascii="Times New Roman" w:hAnsi="Times New Roman"/>
+          <w:color w:val="000000"/>
+          <w:sz w:val="28"/>
+          <w:szCs w:val="28"/>
+        </w:rPr>
+        <w:t>.</w:t>
+      </w:r>
+    </w:p>
+    <w:p>
+      <w:pPr>
+        <w:pStyle w:val="Normal"/>
+        <w:numPr>
+          <w:ilvl w:val="0"/>
+          <w:numId w:val="2"/>
+        </w:numPr>
+        <w:spacing w:lineRule="auto" w:line="360" w:before="0" w:after="0"/>
+        <w:ind w:firstLine="709" w:left="0"/>
+        <w:jc w:val="both"/>
+        <w:rPr/>
+      </w:pPr>
+      <w:r>
+        <w:rPr>
+          <w:rFonts w:eastAsia="Times New Roman" w:cs="Times New Roman" w:ascii="Times New Roman" w:hAnsi="Times New Roman"/>
+          <w:i/>
+          <w:color w:val="000000"/>
+          <w:sz w:val="28"/>
+          <w:szCs w:val="28"/>
+        </w:rPr>
+        <w:t>Безопасность</w:t>
+      </w:r>
+      <w:r>
+        <w:rPr>
+          <w:rFonts w:eastAsia="Times New Roman" w:cs="Times New Roman" w:ascii="Times New Roman" w:hAnsi="Times New Roman"/>
+          <w:i w:val="false"/>
+          <w:iCs w:val="false"/>
+          <w:color w:val="000000"/>
+          <w:sz w:val="28"/>
+          <w:szCs w:val="28"/>
+        </w:rPr>
+        <w:t>: Безопасность сайта заключается в хэшировании всех паролей пользователей, также в запрете доступа обычным пользователям на некоторые страницы и к функциям, разрешённым только админам (например, удаление деталей или готовых сборок)</w:t>
+      </w:r>
+      <w:r>
+        <w:rPr>
+          <w:rFonts w:eastAsia="Times New Roman" w:cs="Times New Roman" w:ascii="Times New Roman" w:hAnsi="Times New Roman"/>
+          <w:color w:val="000000"/>
+          <w:sz w:val="28"/>
+          <w:szCs w:val="28"/>
+        </w:rPr>
+        <w:t>.</w:t>
+      </w:r>
+    </w:p>
+    <w:p>
+      <w:pPr>
+        <w:pStyle w:val="Normal"/>
+        <w:numPr>
+          <w:ilvl w:val="0"/>
+          <w:numId w:val="2"/>
+        </w:numPr>
+        <w:spacing w:lineRule="auto" w:line="480" w:before="0" w:after="0"/>
+        <w:ind w:firstLine="709" w:left="0"/>
+        <w:jc w:val="both"/>
+        <w:rPr/>
+      </w:pPr>
+      <w:r>
+        <w:rPr>
+          <w:rFonts w:eastAsia="Times New Roman" w:cs="Times New Roman" w:ascii="Times New Roman" w:hAnsi="Times New Roman"/>
+          <w:i/>
+          <w:color w:val="000000"/>
+          <w:sz w:val="28"/>
+          <w:szCs w:val="28"/>
+        </w:rPr>
+        <w:t>Стоимость</w:t>
+      </w:r>
+      <w:r>
+        <w:rPr>
+          <w:rFonts w:eastAsia="Times New Roman" w:cs="Times New Roman" w:ascii="Times New Roman" w:hAnsi="Times New Roman"/>
+          <w:i w:val="false"/>
+          <w:iCs w:val="false"/>
+          <w:color w:val="000000"/>
+          <w:sz w:val="28"/>
+          <w:szCs w:val="28"/>
+        </w:rPr>
+        <w:t>: Все затраченные ресурсы были временными</w:t>
+      </w:r>
+    </w:p>
+    <w:p>
+      <w:pPr>
+        <w:pStyle w:val="Heading3"/>
+        <w:numPr>
+          <w:ilvl w:val="0"/>
+          <w:numId w:val="5"/>
+        </w:numPr>
+        <w:spacing w:lineRule="auto" w:line="360" w:before="0" w:after="0"/>
+        <w:ind w:firstLine="709" w:left="0"/>
+        <w:rPr/>
+      </w:pPr>
+      <w:bookmarkStart w:id="3" w:name="__RefHeading___Toc868_3592309458"/>
+      <w:bookmarkEnd w:id="3"/>
+      <w:r>
+        <w:rPr>
+          <w:rFonts w:ascii="Times New Roman" w:hAnsi="Times New Roman"/>
+        </w:rPr>
+        <w:t>Практическая часть</w:t>
+      </w:r>
+    </w:p>
+    <w:p>
+      <w:pPr>
+        <w:pStyle w:val="Normal"/>
+        <w:widowControl/>
+        <w:numPr>
+          <w:ilvl w:val="0"/>
+          <w:numId w:val="2"/>
+        </w:numPr>
+        <w:tabs>
+          <w:tab w:val="clear" w:pos="720"/>
+          <w:tab w:val="left" w:pos="709" w:leader="none"/>
+          <w:tab w:val="left" w:pos="1271" w:leader="none"/>
+        </w:tabs>
+        <w:suppressAutoHyphens w:val="true"/>
+        <w:bidi w:val="0"/>
+        <w:spacing w:lineRule="auto" w:line="360" w:before="0" w:after="0"/>
+        <w:ind w:firstLine="709" w:left="0" w:right="0"/>
+        <w:jc w:val="both"/>
+        <w:rPr/>
+      </w:pPr>
+      <w:r>
+        <w:rPr>
+          <w:rFonts w:eastAsia="Times New Roman" w:cs="Times New Roman" w:ascii="Times New Roman" w:hAnsi="Times New Roman"/>
+          <w:i/>
+          <w:color w:val="000000"/>
+          <w:sz w:val="28"/>
+          <w:szCs w:val="28"/>
+        </w:rPr>
+        <w:t xml:space="preserve">Ход работы </w:t>
+      </w:r>
+      <w:r>
+        <w:rPr>
+          <w:rFonts w:eastAsia="Times New Roman" w:cs="Times New Roman" w:ascii="Times New Roman" w:hAnsi="Times New Roman"/>
+          <w:i w:val="false"/>
+          <w:iCs w:val="false"/>
+          <w:color w:val="000000"/>
+          <w:sz w:val="28"/>
+          <w:szCs w:val="28"/>
+        </w:rPr>
+        <w:t>над проектом Велосборщик заключается в следующих этапах:</w:t>
+      </w:r>
+    </w:p>
+    <w:p>
+      <w:pPr>
+        <w:pStyle w:val="Normal"/>
+        <w:widowControl/>
+        <w:numPr>
+          <w:ilvl w:val="0"/>
+          <w:numId w:val="0"/>
+        </w:numPr>
+        <w:suppressAutoHyphens w:val="true"/>
+        <w:bidi w:val="0"/>
+        <w:spacing w:lineRule="auto" w:line="360" w:before="0" w:after="0"/>
+        <w:ind w:firstLine="709" w:left="0" w:right="0"/>
+        <w:jc w:val="both"/>
+        <w:rPr>
+          <w:rFonts w:ascii="Times New Roman" w:hAnsi="Times New Roman"/>
+        </w:rPr>
+      </w:pPr>
+      <w:r>
+        <w:rPr>
+          <w:rFonts w:eastAsia="Times New Roman" w:cs="Times New Roman" w:ascii="Times New Roman" w:hAnsi="Times New Roman"/>
+          <w:i w:val="false"/>
+          <w:iCs w:val="false"/>
+          <w:color w:val="000000"/>
+          <w:sz w:val="28"/>
+          <w:szCs w:val="28"/>
+        </w:rPr>
+        <w:br/>
+        <w:t>1.</w:t>
+        <w:tab/>
+        <w:t>Выбор технологий: Для разработки веб-приложения было решено использовать Python и библиотеку Flask в качестве основного фреймворка, что обеспечивает простоту и гибкость для создания серверной части.</w:t>
+      </w:r>
+    </w:p>
+    <w:p>
+      <w:pPr>
+        <w:pStyle w:val="Normal"/>
+        <w:widowControl/>
+        <w:numPr>
+          <w:ilvl w:val="0"/>
+          <w:numId w:val="0"/>
+        </w:numPr>
+        <w:suppressAutoHyphens w:val="true"/>
+        <w:bidi w:val="0"/>
+        <w:spacing w:lineRule="auto" w:line="360" w:before="0" w:after="0"/>
+        <w:ind w:firstLine="709" w:left="0" w:right="0"/>
+        <w:jc w:val="both"/>
+        <w:rPr>
+          <w:rFonts w:ascii="Times New Roman" w:hAnsi="Times New Roman"/>
+        </w:rPr>
+      </w:pPr>
+      <w:r>
+        <w:rPr>
+          <w:rFonts w:ascii="Times New Roman" w:hAnsi="Times New Roman"/>
+        </w:rPr>
+      </w:r>
+    </w:p>
+    <w:p>
+      <w:pPr>
+        <w:pStyle w:val="Normal"/>
+        <w:widowControl/>
+        <w:numPr>
+          <w:ilvl w:val="0"/>
+          <w:numId w:val="0"/>
+        </w:numPr>
+        <w:bidi w:val="0"/>
+        <w:spacing w:lineRule="auto" w:line="360" w:before="0" w:after="0"/>
+        <w:ind w:firstLine="709" w:left="0" w:right="0"/>
+        <w:jc w:val="both"/>
+        <w:rPr>
+          <w:rFonts w:ascii="Times New Roman" w:hAnsi="Times New Roman"/>
+        </w:rPr>
+      </w:pPr>
+      <w:r>
+        <w:rPr>
+          <w:rFonts w:eastAsia="Times New Roman" w:cs="Times New Roman" w:ascii="Times New Roman" w:hAnsi="Times New Roman"/>
+          <w:i w:val="false"/>
+          <w:iCs w:val="false"/>
+          <w:color w:val="000000"/>
+          <w:sz w:val="28"/>
+          <w:szCs w:val="28"/>
+        </w:rPr>
+        <w:t>2.</w:t>
+        <w:tab/>
+        <w:t>Создание шаблонов: Весь контент сайта был структурирован с помощью HTML, что дало возможность организовать страницы. Для оформления использовались классы Bootstrap, что обеспечило современный и отзывчивый дизайн.</w:t>
+        <w:br/>
+        <w:br/>
+        <w:t>3.</w:t>
+        <w:tab/>
+        <w:t>Добавление динамики: Для улучшения взаимодействия пользователя с сайтом применялся JavaScript, который добавил интерактивность и динамические элементы на страницы, такие как всплывающее окно с рекомендациями и настраиваемые инструменты сборки велосипедов.</w:t>
+        <w:br/>
+        <w:br/>
+        <w:t>4.</w:t>
+        <w:tab/>
+        <w:t>Работа с базой данных: Для хранения и управления данными использовалась ORM-библиотека SQLAlchemy, которая обеспечила удобный способ работы с базой данных. В качестве базы данных была выбрана SQLite, что дало возможность легко интегрировать и управлять данными без необходимости создания отдельного сервера.</w:t>
+        <w:br/>
+        <w:br/>
+        <w:t>5.</w:t>
+        <w:tab/>
+        <w:t>Тестирование и отладка: После реализации основных функций проводилось тестирование на различных устройствах с целью выявления и устранения возможных ошибок, а также улучшения пользовательского опыта.</w:t>
+        <w:br/>
+        <w:br/>
+        <w:t>6.</w:t>
+        <w:tab/>
+        <w:t xml:space="preserve">Запуск проекта: После завершения всех этапов и тестирования сайт был запущен и стал доступен пользователям, позволяя им собирать и настраивать велосипеды по своим предпочтениям. </w:t>
+        <w:br/>
+      </w:r>
+    </w:p>
+    <w:p>
+      <w:pPr>
+        <w:pStyle w:val="Normal"/>
+        <w:widowControl/>
+        <w:numPr>
+          <w:ilvl w:val="0"/>
+          <w:numId w:val="2"/>
+        </w:numPr>
+        <w:tabs>
+          <w:tab w:val="left" w:pos="720" w:leader="none"/>
+        </w:tabs>
+        <w:suppressAutoHyphens w:val="true"/>
+        <w:bidi w:val="0"/>
+        <w:spacing w:lineRule="auto" w:line="360" w:before="0" w:after="0"/>
+        <w:ind w:firstLine="709" w:left="0" w:right="0"/>
+        <w:jc w:val="left"/>
+        <w:rPr/>
+      </w:pPr>
+      <w:r>
+        <w:rPr>
+          <w:rFonts w:eastAsia="Times New Roman" w:cs="Times New Roman" w:ascii="Times New Roman" w:hAnsi="Times New Roman"/>
+          <w:i/>
+          <w:color w:val="000000"/>
+          <w:sz w:val="28"/>
+          <w:szCs w:val="28"/>
+        </w:rPr>
+        <w:t xml:space="preserve">Представление продукта – </w:t>
+      </w:r>
+      <w:r>
+        <w:rPr>
+          <w:rFonts w:eastAsia="Times New Roman" w:cs="Times New Roman" w:ascii="Times New Roman" w:hAnsi="Times New Roman"/>
+          <w:i w:val="false"/>
+          <w:iCs w:val="false"/>
+          <w:color w:val="000000"/>
+          <w:sz w:val="28"/>
+          <w:szCs w:val="28"/>
+        </w:rPr>
+        <w:t xml:space="preserve">Сайт Велосборщик — веб-приложение, написанное на </w:t>
+      </w:r>
+      <w:r>
+        <w:rPr>
+          <w:rFonts w:eastAsia="Times New Roman" w:cs="Times New Roman" w:ascii="Times New Roman" w:hAnsi="Times New Roman"/>
+          <w:i w:val="false"/>
+          <w:iCs w:val="false"/>
+          <w:color w:val="000000"/>
+          <w:sz w:val="28"/>
+          <w:szCs w:val="28"/>
+          <w:lang w:val="en-US"/>
+        </w:rPr>
+        <w:t xml:space="preserve">Python </w:t>
+      </w:r>
+      <w:r>
+        <w:rPr>
+          <w:rFonts w:eastAsia="Times New Roman" w:cs="Times New Roman" w:ascii="Times New Roman" w:hAnsi="Times New Roman"/>
+          <w:i w:val="false"/>
+          <w:iCs w:val="false"/>
+          <w:color w:val="000000"/>
+          <w:sz w:val="28"/>
+          <w:szCs w:val="28"/>
+          <w:lang w:val="ru-RU"/>
+        </w:rPr>
+        <w:t xml:space="preserve">при помощи библиотеки </w:t>
+      </w:r>
+      <w:r>
+        <w:rPr>
+          <w:rFonts w:eastAsia="Times New Roman" w:cs="Times New Roman" w:ascii="Times New Roman" w:hAnsi="Times New Roman"/>
+          <w:i w:val="false"/>
+          <w:iCs w:val="false"/>
+          <w:color w:val="000000"/>
+          <w:sz w:val="28"/>
+          <w:szCs w:val="28"/>
+          <w:lang w:val="en-US"/>
+        </w:rPr>
+        <w:t xml:space="preserve">flask. </w:t>
+      </w:r>
+      <w:r>
+        <w:rPr>
+          <w:rFonts w:eastAsia="Times New Roman" w:cs="Times New Roman" w:ascii="Times New Roman" w:hAnsi="Times New Roman"/>
+          <w:i w:val="false"/>
+          <w:iCs w:val="false"/>
+          <w:color w:val="000000"/>
+          <w:sz w:val="28"/>
+          <w:szCs w:val="28"/>
+          <w:lang w:val="ru-RU"/>
+        </w:rPr>
+        <w:t>Все шаблоны страниц сайта делались на</w:t>
       </w:r>
       <w:r>
         <w:rPr>
@@ -2214,11 +2751,11 @@
           <w:smallCaps w:val="false"/>
           <w:color w:val="000000"/>
           <w:spacing w:val="0"/>
-          <w:sz w:val="28"/>
-          <w:szCs w:val="28"/>
-          <w:lang w:val="en-US"/>
-        </w:rPr>
-        <w:t xml:space="preserve">Bootstrap, </w:t>
+          <w:sz w:val="24"/>
+          <w:szCs w:val="28"/>
+          <w:lang w:val="ru-RU"/>
+        </w:rPr>
+        <w:t xml:space="preserve"> </w:t>
       </w:r>
       <w:r>
         <w:rPr>
@@ -2231,11 +2768,11 @@
           <w:smallCaps w:val="false"/>
           <w:color w:val="000000"/>
           <w:spacing w:val="0"/>
-          <w:sz w:val="28"/>
-          <w:szCs w:val="28"/>
-          <w:lang w:val="ru-RU"/>
-        </w:rPr>
-        <w:t xml:space="preserve">для динамичности сайта использовался язык </w:t>
+          <w:sz w:val="24"/>
+          <w:szCs w:val="28"/>
+          <w:lang w:val="en-US"/>
+        </w:rPr>
+        <w:t xml:space="preserve">HTML </w:t>
       </w:r>
       <w:r>
         <w:rPr>
@@ -2252,372 +2789,114 @@
           <w:szCs w:val="28"/>
           <w:lang w:val="en-US"/>
         </w:rPr>
-        <w:t>JavaScript</w:t>
-      </w:r>
-      <w:r>
-        <w:rPr>
-          <w:rFonts w:eastAsia="Times New Roman" w:cs="Times New Roman" w:ascii="Times New Roman" w:hAnsi="Times New Roman"/>
-          <w:color w:val="000000"/>
-          <w:sz w:val="28"/>
-          <w:szCs w:val="28"/>
-        </w:rPr>
-        <w:t xml:space="preserve">. </w:t>
-      </w:r>
-      <w:r>
-        <w:rPr>
-          <w:rFonts w:eastAsia="Times New Roman" w:cs="Times New Roman" w:ascii="Times New Roman" w:hAnsi="Times New Roman"/>
-          <w:color w:val="000000"/>
-          <w:sz w:val="28"/>
-          <w:szCs w:val="28"/>
-        </w:rPr>
-        <w:t>Работа с БД выполнялась через библиотеку</w:t>
-      </w:r>
-      <w:r>
-        <w:rPr>
-          <w:rFonts w:eastAsia="Times New Roman" w:cs="Times New Roman" w:ascii="Times New Roman" w:hAnsi="Times New Roman"/>
-          <w:color w:val="000000"/>
-          <w:sz w:val="28"/>
-          <w:szCs w:val="28"/>
-          <w:lang w:val="en-US"/>
-        </w:rPr>
-        <w:t xml:space="preserve"> ORM sqlalchemy, </w:t>
-      </w:r>
-      <w:r>
-        <w:rPr>
-          <w:rFonts w:eastAsia="Times New Roman" w:cs="Times New Roman" w:ascii="Times New Roman" w:hAnsi="Times New Roman"/>
-          <w:color w:val="000000"/>
-          <w:sz w:val="28"/>
-          <w:szCs w:val="28"/>
-          <w:lang w:val="ru-RU"/>
-        </w:rPr>
-        <w:t xml:space="preserve">сама база данных — </w:t>
-      </w:r>
-      <w:r>
-        <w:rPr>
-          <w:rFonts w:eastAsia="Times New Roman" w:cs="Times New Roman" w:ascii="Times New Roman" w:hAnsi="Times New Roman"/>
-          <w:color w:val="000000"/>
-          <w:sz w:val="28"/>
-          <w:szCs w:val="28"/>
-          <w:lang w:val="en-US"/>
-        </w:rPr>
-        <w:t>SqlLite</w:t>
-      </w:r>
-      <w:r>
-        <w:rPr>
-          <w:rFonts w:eastAsia="Times New Roman" w:cs="Times New Roman" w:ascii="Times New Roman" w:hAnsi="Times New Roman"/>
-          <w:color w:val="000000"/>
-          <w:sz w:val="28"/>
-          <w:szCs w:val="28"/>
-        </w:rPr>
-        <w:t>.</w:t>
-      </w:r>
-    </w:p>
-    <w:p>
-      <w:pPr>
-        <w:pStyle w:val="Normal"/>
-        <w:numPr>
-          <w:ilvl w:val="0"/>
-          <w:numId w:val="2"/>
-        </w:numPr>
-        <w:pBdr/>
-        <w:spacing w:lineRule="auto" w:line="360" w:before="0" w:after="0"/>
-        <w:jc w:val="both"/>
-        <w:rPr>
-          <w:rFonts w:ascii="Times New Roman" w:hAnsi="Times New Roman" w:eastAsia="Times New Roman" w:cs="Times New Roman"/>
-          <w:i/>
-          <w:i/>
-          <w:color w:val="000000"/>
-          <w:sz w:val="28"/>
-          <w:szCs w:val="28"/>
-        </w:rPr>
-      </w:pPr>
-      <w:r>
-        <w:rPr>
-          <w:rFonts w:eastAsia="Times New Roman" w:cs="Times New Roman" w:ascii="Times New Roman" w:hAnsi="Times New Roman"/>
-          <w:i/>
-          <w:color w:val="000000"/>
-          <w:sz w:val="28"/>
-          <w:szCs w:val="28"/>
-        </w:rPr>
-        <w:t>Функциональность</w:t>
-      </w:r>
-      <w:r>
-        <w:rPr>
-          <w:rFonts w:eastAsia="Times New Roman" w:cs="Times New Roman" w:ascii="Times New Roman" w:hAnsi="Times New Roman"/>
+        <w:t xml:space="preserve">– </w:t>
+      </w:r>
+      <w:r>
+        <w:rPr>
+          <w:rStyle w:val="Strong"/>
+          <w:rFonts w:eastAsia="Times New Roman" w:cs="Times New Roman" w:ascii="Times New Roman" w:hAnsi="Times New Roman"/>
+          <w:b w:val="false"/>
           <w:i w:val="false"/>
           <w:iCs w:val="false"/>
-          <w:color w:val="000000"/>
-          <w:sz w:val="28"/>
-          <w:szCs w:val="28"/>
-        </w:rPr>
-        <w:t xml:space="preserve">: </w:t>
-      </w:r>
-      <w:r>
-        <w:rPr>
-          <w:rFonts w:eastAsia="Times New Roman" w:cs="Times New Roman" w:ascii="Times New Roman" w:hAnsi="Times New Roman"/>
+          <w:caps w:val="false"/>
+          <w:smallCaps w:val="false"/>
+          <w:color w:val="000000"/>
+          <w:spacing w:val="0"/>
+          <w:sz w:val="28"/>
+          <w:szCs w:val="28"/>
+          <w:lang w:val="ru-RU"/>
+        </w:rPr>
+        <w:t xml:space="preserve">языке гипертекстовой разметки для структурирования и оформления с использованием классов </w:t>
+      </w:r>
+      <w:r>
+        <w:rPr>
+          <w:rStyle w:val="Strong"/>
+          <w:rFonts w:eastAsia="Times New Roman" w:cs="Times New Roman" w:ascii="Times New Roman" w:hAnsi="Times New Roman"/>
+          <w:b w:val="false"/>
           <w:i w:val="false"/>
           <w:iCs w:val="false"/>
-          <w:color w:val="000000"/>
-          <w:sz w:val="28"/>
-          <w:szCs w:val="28"/>
-        </w:rPr>
-        <w:t>возможность добавления или удаления деталей, сборок со стороны администрации сайта</w:t>
-      </w:r>
-      <w:r>
-        <w:rPr>
-          <w:rFonts w:eastAsia="Times New Roman" w:cs="Times New Roman" w:ascii="Times New Roman" w:hAnsi="Times New Roman"/>
-          <w:color w:val="000000"/>
-          <w:sz w:val="28"/>
-          <w:szCs w:val="28"/>
-        </w:rPr>
-        <w:t>.</w:t>
-      </w:r>
-    </w:p>
-    <w:p>
-      <w:pPr>
-        <w:pStyle w:val="Normal"/>
-        <w:numPr>
-          <w:ilvl w:val="0"/>
-          <w:numId w:val="2"/>
-        </w:numPr>
-        <w:pBdr/>
-        <w:spacing w:lineRule="auto" w:line="360" w:before="0" w:after="0"/>
-        <w:jc w:val="both"/>
-        <w:rPr>
-          <w:rFonts w:ascii="Times New Roman" w:hAnsi="Times New Roman" w:eastAsia="Times New Roman" w:cs="Times New Roman"/>
-          <w:color w:val="000000"/>
-          <w:sz w:val="28"/>
-          <w:szCs w:val="28"/>
-        </w:rPr>
-      </w:pPr>
-      <w:r>
-        <w:rPr>
-          <w:rFonts w:eastAsia="Times New Roman" w:cs="Times New Roman" w:ascii="Times New Roman" w:hAnsi="Times New Roman"/>
-          <w:i/>
-          <w:color w:val="000000"/>
-          <w:sz w:val="28"/>
-          <w:szCs w:val="28"/>
-        </w:rPr>
-        <w:t>Дизайн</w:t>
-      </w:r>
-      <w:r>
-        <w:rPr>
-          <w:rFonts w:eastAsia="Times New Roman" w:cs="Times New Roman" w:ascii="Times New Roman" w:hAnsi="Times New Roman"/>
+          <w:caps w:val="false"/>
+          <w:smallCaps w:val="false"/>
+          <w:color w:val="000000"/>
+          <w:spacing w:val="0"/>
+          <w:sz w:val="28"/>
+          <w:szCs w:val="28"/>
+          <w:lang w:val="en-US"/>
+        </w:rPr>
+        <w:t xml:space="preserve">Bootstrap, </w:t>
+      </w:r>
+      <w:r>
+        <w:rPr>
+          <w:rStyle w:val="Strong"/>
+          <w:rFonts w:eastAsia="Times New Roman" w:cs="Times New Roman" w:ascii="Times New Roman" w:hAnsi="Times New Roman"/>
+          <w:b w:val="false"/>
           <w:i w:val="false"/>
           <w:iCs w:val="false"/>
-          <w:color w:val="000000"/>
-          <w:sz w:val="28"/>
-          <w:szCs w:val="28"/>
-        </w:rPr>
-        <w:t>:</w:t>
-      </w:r>
-      <w:r>
-        <w:rPr>
-          <w:rFonts w:eastAsia="Times New Roman" w:cs="Times New Roman" w:ascii="Times New Roman" w:hAnsi="Times New Roman"/>
-          <w:i/>
-          <w:color w:val="000000"/>
-          <w:sz w:val="28"/>
-          <w:szCs w:val="28"/>
-        </w:rPr>
-        <w:t xml:space="preserve"> </w:t>
+          <w:caps w:val="false"/>
+          <w:smallCaps w:val="false"/>
+          <w:color w:val="000000"/>
+          <w:spacing w:val="0"/>
+          <w:sz w:val="28"/>
+          <w:szCs w:val="28"/>
+          <w:lang w:val="ru-RU"/>
+        </w:rPr>
+        <w:t xml:space="preserve">для динамичности сайта использовался язык </w:t>
       </w:r>
       <w:r>
         <w:rPr>
           <w:rStyle w:val="Strong"/>
-          <w:rFonts w:eastAsia="Times New Roman" w:cs="Times New Roman" w:ascii="YS Text;apple-system;BlinkMacSystemFont;Arial;Helvetica;sans-serif" w:hAnsi="YS Text;apple-system;BlinkMacSystemFont;Arial;Helvetica;sans-serif"/>
+          <w:rFonts w:eastAsia="Times New Roman" w:cs="Times New Roman" w:ascii="Times New Roman" w:hAnsi="Times New Roman"/>
           <w:b w:val="false"/>
           <w:i w:val="false"/>
+          <w:iCs w:val="false"/>
           <w:caps w:val="false"/>
           <w:smallCaps w:val="false"/>
           <w:color w:val="000000"/>
           <w:spacing w:val="0"/>
-          <w:sz w:val="24"/>
-          <w:szCs w:val="28"/>
-        </w:rPr>
-        <w:t xml:space="preserve">Дизайн сайта делался с использованием классов </w:t>
-      </w:r>
-      <w:r>
-        <w:rPr>
-          <w:rStyle w:val="Strong"/>
-          <w:rFonts w:eastAsia="Times New Roman" w:cs="Times New Roman" w:ascii="YS Text;apple-system;BlinkMacSystemFont;Arial;Helvetica;sans-serif" w:hAnsi="YS Text;apple-system;BlinkMacSystemFont;Arial;Helvetica;sans-serif"/>
-          <w:b w:val="false"/>
-          <w:i w:val="false"/>
-          <w:caps w:val="false"/>
-          <w:smallCaps w:val="false"/>
-          <w:color w:val="000000"/>
-          <w:spacing w:val="0"/>
-          <w:sz w:val="24"/>
+          <w:sz w:val="28"/>
           <w:szCs w:val="28"/>
           <w:lang w:val="en-US"/>
         </w:rPr>
-        <w:t>Bootstrap</w:t>
-      </w:r>
-      <w:r>
-        <w:rPr>
-          <w:rStyle w:val="Strong"/>
-          <w:rFonts w:eastAsia="Times New Roman" w:cs="Times New Roman" w:ascii="YS Text;apple-system;BlinkMacSystemFont;Arial;Helvetica;sans-serif" w:hAnsi="YS Text;apple-system;BlinkMacSystemFont;Arial;Helvetica;sans-serif"/>
-          <w:b w:val="false"/>
-          <w:i w:val="false"/>
-          <w:caps w:val="false"/>
-          <w:smallCaps w:val="false"/>
-          <w:color w:val="000000"/>
-          <w:spacing w:val="0"/>
-          <w:sz w:val="24"/>
+        <w:t>JavaScript</w:t>
+      </w:r>
+      <w:r>
+        <w:rPr>
+          <w:rFonts w:eastAsia="Times New Roman" w:cs="Times New Roman" w:ascii="Times New Roman" w:hAnsi="Times New Roman"/>
+          <w:color w:val="000000"/>
+          <w:sz w:val="28"/>
+          <w:szCs w:val="28"/>
+        </w:rPr>
+        <w:t>. Работа с БД выполнялась через библиотеку</w:t>
+      </w:r>
+      <w:r>
+        <w:rPr>
+          <w:rFonts w:eastAsia="Times New Roman" w:cs="Times New Roman" w:ascii="Times New Roman" w:hAnsi="Times New Roman"/>
+          <w:color w:val="000000"/>
+          <w:sz w:val="28"/>
+          <w:szCs w:val="28"/>
+          <w:lang w:val="en-US"/>
+        </w:rPr>
+        <w:t xml:space="preserve"> ORM sqlalchemy, </w:t>
+      </w:r>
+      <w:r>
+        <w:rPr>
+          <w:rFonts w:eastAsia="Times New Roman" w:cs="Times New Roman" w:ascii="Times New Roman" w:hAnsi="Times New Roman"/>
+          <w:color w:val="000000"/>
+          <w:sz w:val="28"/>
           <w:szCs w:val="28"/>
           <w:lang w:val="ru-RU"/>
         </w:rPr>
-        <w:t xml:space="preserve"> для улучшения читаемости и внешнего вида</w:t>
-      </w:r>
-      <w:r>
-        <w:rPr>
-          <w:rFonts w:eastAsia="Times New Roman" w:cs="Times New Roman" w:ascii="Times New Roman" w:hAnsi="Times New Roman"/>
-          <w:color w:val="000000"/>
-          <w:sz w:val="28"/>
-          <w:szCs w:val="28"/>
-        </w:rPr>
-        <w:t>.</w:t>
-      </w:r>
-    </w:p>
-    <w:p>
-      <w:pPr>
-        <w:pStyle w:val="Normal"/>
-        <w:numPr>
-          <w:ilvl w:val="0"/>
-          <w:numId w:val="2"/>
-        </w:numPr>
-        <w:pBdr/>
-        <w:spacing w:lineRule="auto" w:line="360" w:before="0" w:after="0"/>
-        <w:jc w:val="both"/>
-        <w:rPr>
-          <w:rFonts w:ascii="Times New Roman" w:hAnsi="Times New Roman" w:eastAsia="Times New Roman" w:cs="Times New Roman"/>
-          <w:color w:val="000000"/>
-          <w:sz w:val="28"/>
-          <w:szCs w:val="28"/>
-        </w:rPr>
-      </w:pPr>
-      <w:r>
-        <w:rPr>
-          <w:rFonts w:eastAsia="Times New Roman" w:cs="Times New Roman" w:ascii="Times New Roman" w:hAnsi="Times New Roman"/>
-          <w:i/>
-          <w:color w:val="000000"/>
-          <w:sz w:val="28"/>
-          <w:szCs w:val="28"/>
-        </w:rPr>
-        <w:t>Безопасность</w:t>
-      </w:r>
-      <w:r>
-        <w:rPr>
-          <w:rFonts w:eastAsia="Times New Roman" w:cs="Times New Roman" w:ascii="Times New Roman" w:hAnsi="Times New Roman"/>
-          <w:i w:val="false"/>
-          <w:iCs w:val="false"/>
-          <w:color w:val="000000"/>
-          <w:sz w:val="28"/>
-          <w:szCs w:val="28"/>
-        </w:rPr>
-        <w:t xml:space="preserve">: </w:t>
-      </w:r>
-      <w:r>
-        <w:rPr>
-          <w:rFonts w:eastAsia="Times New Roman" w:cs="Times New Roman" w:ascii="Times New Roman" w:hAnsi="Times New Roman"/>
-          <w:i w:val="false"/>
-          <w:iCs w:val="false"/>
-          <w:color w:val="000000"/>
-          <w:sz w:val="28"/>
-          <w:szCs w:val="28"/>
-        </w:rPr>
-        <w:t>Безопасность сайта заключается в хэшировании всех паролей пользователей, также в запрете доступа обычным пользователям на</w:t>
-      </w:r>
-      <w:r>
-        <w:rPr>
-          <w:rFonts w:eastAsia="Times New Roman" w:cs="Times New Roman" w:ascii="Times New Roman" w:hAnsi="Times New Roman"/>
-          <w:i w:val="false"/>
-          <w:iCs w:val="false"/>
-          <w:color w:val="000000"/>
-          <w:sz w:val="28"/>
-          <w:szCs w:val="28"/>
-        </w:rPr>
-        <w:t xml:space="preserve"> некоторые</w:t>
-      </w:r>
-      <w:r>
-        <w:rPr>
-          <w:rFonts w:eastAsia="Times New Roman" w:cs="Times New Roman" w:ascii="Times New Roman" w:hAnsi="Times New Roman"/>
-          <w:i w:val="false"/>
-          <w:iCs w:val="false"/>
-          <w:color w:val="000000"/>
-          <w:sz w:val="28"/>
-          <w:szCs w:val="28"/>
-        </w:rPr>
-        <w:t xml:space="preserve"> страницы и к функциям, разрешённым только админам </w:t>
-      </w:r>
-      <w:r>
-        <w:rPr>
-          <w:rFonts w:eastAsia="Times New Roman" w:cs="Times New Roman" w:ascii="Times New Roman" w:hAnsi="Times New Roman"/>
-          <w:i w:val="false"/>
-          <w:iCs w:val="false"/>
-          <w:color w:val="000000"/>
-          <w:sz w:val="28"/>
-          <w:szCs w:val="28"/>
-        </w:rPr>
-        <w:t>(например, удаление деталей или готовых сборок)</w:t>
-      </w:r>
-      <w:r>
-        <w:rPr>
-          <w:rFonts w:eastAsia="Times New Roman" w:cs="Times New Roman" w:ascii="Times New Roman" w:hAnsi="Times New Roman"/>
-          <w:color w:val="000000"/>
-          <w:sz w:val="28"/>
-          <w:szCs w:val="28"/>
-        </w:rPr>
-        <w:t>.</w:t>
-      </w:r>
-    </w:p>
-    <w:p>
-      <w:pPr>
-        <w:pStyle w:val="Normal"/>
-        <w:numPr>
-          <w:ilvl w:val="0"/>
-          <w:numId w:val="2"/>
-        </w:numPr>
-        <w:pBdr/>
-        <w:spacing w:lineRule="auto" w:line="360" w:before="0" w:after="0"/>
-        <w:jc w:val="both"/>
-        <w:rPr>
-          <w:rFonts w:ascii="Times New Roman" w:hAnsi="Times New Roman" w:eastAsia="Times New Roman" w:cs="Times New Roman"/>
-          <w:color w:val="000000"/>
-          <w:sz w:val="28"/>
-          <w:szCs w:val="28"/>
-        </w:rPr>
-      </w:pPr>
-      <w:r>
-        <w:rPr>
-          <w:rFonts w:eastAsia="Times New Roman" w:cs="Times New Roman" w:ascii="Times New Roman" w:hAnsi="Times New Roman"/>
-          <w:i/>
-          <w:color w:val="000000"/>
-          <w:sz w:val="28"/>
-          <w:szCs w:val="28"/>
-        </w:rPr>
-        <w:t>Стоимость</w:t>
-      </w:r>
-      <w:r>
-        <w:rPr>
-          <w:rFonts w:eastAsia="Times New Roman" w:cs="Times New Roman" w:ascii="Times New Roman" w:hAnsi="Times New Roman"/>
-          <w:i w:val="false"/>
-          <w:iCs w:val="false"/>
-          <w:color w:val="000000"/>
-          <w:sz w:val="28"/>
-          <w:szCs w:val="28"/>
-        </w:rPr>
-        <w:t xml:space="preserve">: </w:t>
-      </w:r>
-      <w:r>
-        <w:rPr>
-          <w:rFonts w:eastAsia="Times New Roman" w:cs="Times New Roman" w:ascii="Times New Roman" w:hAnsi="Times New Roman"/>
-          <w:i w:val="false"/>
-          <w:iCs w:val="false"/>
-          <w:color w:val="000000"/>
-          <w:sz w:val="28"/>
-          <w:szCs w:val="28"/>
-        </w:rPr>
-        <w:t>Все затраченные ресурсы были временными</w:t>
+        <w:t xml:space="preserve">сама база данных — </w:t>
+      </w:r>
+      <w:r>
+        <w:rPr>
+          <w:rFonts w:eastAsia="Times New Roman" w:cs="Times New Roman" w:ascii="Times New Roman" w:hAnsi="Times New Roman"/>
+          <w:color w:val="000000"/>
+          <w:sz w:val="28"/>
+          <w:szCs w:val="28"/>
+          <w:lang w:val="en-US"/>
+        </w:rPr>
+        <w:t>SqlLite.</w:t>
       </w:r>
     </w:p>
     <w:p>
@@ -2627,80 +2906,19 @@
           <w:ilvl w:val="0"/>
           <w:numId w:val="5"/>
         </w:numPr>
-        <w:rPr/>
-      </w:pPr>
-      <w:bookmarkStart w:id="4" w:name="__RefHeading___Toc868_3592309458"/>
+        <w:spacing w:lineRule="auto" w:line="360" w:before="0" w:after="0"/>
+        <w:ind w:firstLine="709" w:left="0"/>
+        <w:rPr>
+          <w:rFonts w:ascii="Times New Roman" w:hAnsi="Times New Roman"/>
+        </w:rPr>
+      </w:pPr>
+      <w:bookmarkStart w:id="4" w:name="__RefHeading___Toc870_3592309458"/>
       <w:bookmarkEnd w:id="4"/>
       <w:r>
-        <w:rPr/>
-        <w:t>Практическая часть</w:t>
-      </w:r>
-    </w:p>
-    <w:p>
-      <w:pPr>
-        <w:pStyle w:val="Normal"/>
-        <w:pBdr/>
-        <w:spacing w:lineRule="auto" w:line="360" w:before="0" w:after="0"/>
-        <w:ind w:firstLine="567"/>
-        <w:jc w:val="both"/>
-        <w:rPr>
-          <w:rFonts w:ascii="Times New Roman" w:hAnsi="Times New Roman" w:eastAsia="Times New Roman" w:cs="Times New Roman"/>
-          <w:color w:val="000000"/>
-          <w:sz w:val="28"/>
-          <w:szCs w:val="28"/>
-        </w:rPr>
-      </w:pPr>
-      <w:r>
-        <w:rPr>
-          <w:rFonts w:eastAsia="Times New Roman" w:cs="Times New Roman" w:ascii="Times New Roman" w:hAnsi="Times New Roman"/>
-          <w:color w:val="000000"/>
-          <w:sz w:val="28"/>
-          <w:szCs w:val="28"/>
-        </w:rPr>
-        <w:t>Практическая часть содержит описание хода работы, представление результата, тестирование продукта.</w:t>
-      </w:r>
-    </w:p>
-    <w:p>
-      <w:pPr>
-        <w:pStyle w:val="Normal"/>
-        <w:numPr>
-          <w:ilvl w:val="0"/>
-          <w:numId w:val="2"/>
-        </w:numPr>
-        <w:pBdr/>
-        <w:spacing w:lineRule="auto" w:line="360" w:before="0" w:after="0"/>
-        <w:jc w:val="both"/>
-        <w:rPr>
-          <w:rFonts w:ascii="Times New Roman" w:hAnsi="Times New Roman" w:eastAsia="Times New Roman" w:cs="Times New Roman"/>
-          <w:i/>
-          <w:i/>
-          <w:color w:val="000000"/>
-          <w:sz w:val="28"/>
-          <w:szCs w:val="28"/>
-        </w:rPr>
-      </w:pPr>
-      <w:r>
-        <w:rPr>
-          <w:rFonts w:eastAsia="Times New Roman" w:cs="Times New Roman" w:ascii="Times New Roman" w:hAnsi="Times New Roman"/>
-          <w:i/>
-          <w:color w:val="000000"/>
-          <w:sz w:val="28"/>
-          <w:szCs w:val="28"/>
-        </w:rPr>
-        <w:t xml:space="preserve">Ход работы </w:t>
-      </w:r>
-      <w:r>
-        <w:rPr>
-          <w:rFonts w:eastAsia="Times New Roman" w:cs="Times New Roman" w:ascii="Times New Roman" w:hAnsi="Times New Roman"/>
-          <w:i w:val="false"/>
-          <w:iCs w:val="false"/>
-          <w:color w:val="000000"/>
-          <w:sz w:val="28"/>
-          <w:szCs w:val="28"/>
-        </w:rPr>
-        <w:t>над проектом Велосборщик заключается в следующих этапах:</w:t>
-        <w:br/>
-        <w:t>1. Выбор технологий: Для разработки веб-приложения было решено использовать Python и библиотеку Flask в качестве основного фреймворка, что обеспечивает простоту и гибкость для создания серверной части.</w:t>
+        <w:rPr>
+          <w:rFonts w:ascii="Times New Roman" w:hAnsi="Times New Roman"/>
+        </w:rPr>
+        <w:t>Заключение</w:t>
       </w:r>
     </w:p>
     <w:p>
@@ -2709,406 +2927,38 @@
         <w:widowControl/>
         <w:numPr>
           <w:ilvl w:val="0"/>
-          <w:numId w:val="0"/>
+          <w:numId w:val="3"/>
         </w:numPr>
-        <w:pBdr/>
+        <w:suppressAutoHyphens w:val="true"/>
         <w:bidi w:val="0"/>
         <w:spacing w:lineRule="auto" w:line="360" w:before="0" w:after="0"/>
-        <w:ind w:hanging="0" w:left="567" w:right="0"/>
+        <w:ind w:firstLine="709" w:left="0" w:right="0"/>
         <w:jc w:val="both"/>
         <w:rPr>
-          <w:rFonts w:ascii="Times New Roman" w:hAnsi="Times New Roman" w:eastAsia="Times New Roman" w:cs="Times New Roman"/>
+          <w:rFonts w:ascii="Times New Roman" w:hAnsi="Times New Roman"/>
+        </w:rPr>
+      </w:pPr>
+      <w:r>
+        <w:rPr>
+          <w:rFonts w:eastAsia="Times New Roman" w:cs="Times New Roman" w:ascii="Times New Roman" w:hAnsi="Times New Roman"/>
           <w:i/>
-          <w:i/>
-          <w:color w:val="000000"/>
-          <w:sz w:val="28"/>
-          <w:szCs w:val="28"/>
-        </w:rPr>
-      </w:pPr>
-      <w:r>
-        <w:rPr>
-          <w:rFonts w:eastAsia="Times New Roman" w:cs="Times New Roman" w:ascii="Times New Roman" w:hAnsi="Times New Roman"/>
-          <w:i w:val="false"/>
-          <w:iCs w:val="false"/>
-          <w:color w:val="000000"/>
-          <w:sz w:val="28"/>
-          <w:szCs w:val="28"/>
-        </w:rPr>
-        <w:br/>
-        <w:t>2. Создание шаблонов: Весь контент сайта был структурирован с помощью HTML, что дало возможность организовать страницы. Для оформления использовались классы Bootstrap, что обеспечило современный и отзывчивый дизайн.</w:t>
-        <w:br/>
-        <w:br/>
-        <w:t>3. Добавление динамики: Для улучшения взаимодействия пользователя с сайтом применялся JavaScript, который добавил интерактивность и динамические элементы на страницы, такие как всплывающее окно с рекомендациями и настраиваемые инструменты сборки велосипедов.</w:t>
-        <w:br/>
-        <w:br/>
-        <w:t>4. Работа с базой данных: Для хранения и управления данными использовалась ORM-библиотека SQLAlchemy, которая обеспечила удобный способ работы с базой данных. В качестве базы данных была выбрана SQLite, что дало возможность легко интегрировать и управлять данными без необходимости создания отдельного сервера.</w:t>
-        <w:br/>
-        <w:br/>
-        <w:t>5. Тестирование и отладка: После реализации основных функций проводилось тестирование на различных устройствах с целью выявления и устранения возможных ошибок, а также улучшения пользовательского опыта.</w:t>
-        <w:br/>
-        <w:br/>
-        <w:t xml:space="preserve">6. Запуск проекта: После завершения всех этапов и тестирования сайт был запущен и стал доступен пользователям, позволяя им собирать и настраивать велосипеды по своим предпочтениям. </w:t>
-        <w:br/>
-        <w:br/>
-        <w:t>Таким образом, проект "Сайт Велосборщик" был реализован с акцентом на удобство, функциональность и визуальную привлекательность.</w:t>
-      </w:r>
-    </w:p>
-    <w:p>
-      <w:pPr>
-        <w:pStyle w:val="Normal"/>
-        <w:numPr>
-          <w:ilvl w:val="0"/>
-          <w:numId w:val="2"/>
-        </w:numPr>
-        <w:pBdr/>
-        <w:spacing w:lineRule="auto" w:line="360" w:before="0" w:after="0"/>
-        <w:rPr>
-          <w:rFonts w:ascii="Times New Roman" w:hAnsi="Times New Roman" w:eastAsia="Times New Roman" w:cs="Times New Roman"/>
-          <w:color w:val="000000"/>
-          <w:sz w:val="28"/>
-          <w:szCs w:val="28"/>
-        </w:rPr>
-      </w:pPr>
-      <w:r>
-        <w:rPr>
-          <w:rFonts w:eastAsia="Times New Roman" w:cs="Times New Roman" w:ascii="Times New Roman" w:hAnsi="Times New Roman"/>
-          <w:i/>
-          <w:color w:val="000000"/>
-          <w:sz w:val="28"/>
-          <w:szCs w:val="28"/>
-        </w:rPr>
-        <w:t xml:space="preserve">Представление продукта – </w:t>
-      </w:r>
-      <w:r>
-        <w:rPr>
-          <w:rFonts w:eastAsia="Times New Roman" w:cs="Times New Roman" w:ascii="Times New Roman" w:hAnsi="Times New Roman"/>
-          <w:i w:val="false"/>
-          <w:iCs w:val="false"/>
-          <w:color w:val="000000"/>
-          <w:sz w:val="28"/>
-          <w:szCs w:val="28"/>
-        </w:rPr>
-        <w:t xml:space="preserve">Сайт Велосборщик — веб-приложение, написанное на </w:t>
-      </w:r>
-      <w:r>
-        <w:rPr>
-          <w:rFonts w:eastAsia="Times New Roman" w:cs="Times New Roman" w:ascii="Times New Roman" w:hAnsi="Times New Roman"/>
-          <w:i w:val="false"/>
-          <w:iCs w:val="false"/>
-          <w:color w:val="000000"/>
-          <w:sz w:val="28"/>
-          <w:szCs w:val="28"/>
-          <w:lang w:val="en-US"/>
-        </w:rPr>
-        <w:t xml:space="preserve">Python </w:t>
-      </w:r>
-      <w:r>
-        <w:rPr>
-          <w:rFonts w:eastAsia="Times New Roman" w:cs="Times New Roman" w:ascii="Times New Roman" w:hAnsi="Times New Roman"/>
-          <w:i w:val="false"/>
-          <w:iCs w:val="false"/>
-          <w:color w:val="000000"/>
-          <w:sz w:val="28"/>
-          <w:szCs w:val="28"/>
-          <w:lang w:val="ru-RU"/>
-        </w:rPr>
-        <w:t xml:space="preserve">при помощи библиотеки </w:t>
-      </w:r>
-      <w:r>
-        <w:rPr>
-          <w:rFonts w:eastAsia="Times New Roman" w:cs="Times New Roman" w:ascii="Times New Roman" w:hAnsi="Times New Roman"/>
-          <w:i w:val="false"/>
-          <w:iCs w:val="false"/>
-          <w:color w:val="000000"/>
-          <w:sz w:val="28"/>
-          <w:szCs w:val="28"/>
-          <w:lang w:val="en-US"/>
-        </w:rPr>
-        <w:t xml:space="preserve">flask. </w:t>
-      </w:r>
-      <w:r>
-        <w:rPr>
-          <w:rFonts w:eastAsia="Times New Roman" w:cs="Times New Roman" w:ascii="Times New Roman" w:hAnsi="Times New Roman"/>
-          <w:i w:val="false"/>
-          <w:iCs w:val="false"/>
-          <w:color w:val="000000"/>
-          <w:sz w:val="28"/>
-          <w:szCs w:val="28"/>
-          <w:lang w:val="ru-RU"/>
-        </w:rPr>
-        <w:t xml:space="preserve">Все шаблоны страниц сайта </w:t>
-      </w:r>
-      <w:r>
-        <w:rPr>
-          <w:rFonts w:eastAsia="Times New Roman" w:cs="Times New Roman" w:ascii="Times New Roman" w:hAnsi="Times New Roman"/>
-          <w:i w:val="false"/>
-          <w:iCs w:val="false"/>
-          <w:color w:val="000000"/>
-          <w:sz w:val="28"/>
-          <w:szCs w:val="28"/>
-          <w:lang w:val="ru-RU"/>
-        </w:rPr>
-        <w:t>делал</w:t>
-      </w:r>
-      <w:r>
-        <w:rPr>
-          <w:rFonts w:eastAsia="Times New Roman" w:cs="Times New Roman" w:ascii="Times New Roman" w:hAnsi="Times New Roman"/>
-          <w:i w:val="false"/>
-          <w:iCs w:val="false"/>
-          <w:color w:val="000000"/>
-          <w:sz w:val="28"/>
-          <w:szCs w:val="28"/>
-          <w:lang w:val="ru-RU"/>
-        </w:rPr>
-        <w:t>ись</w:t>
-      </w:r>
-      <w:r>
-        <w:rPr>
-          <w:rFonts w:eastAsia="Times New Roman" w:cs="Times New Roman" w:ascii="Times New Roman" w:hAnsi="Times New Roman"/>
-          <w:i w:val="false"/>
-          <w:iCs w:val="false"/>
-          <w:color w:val="000000"/>
-          <w:sz w:val="28"/>
-          <w:szCs w:val="28"/>
-          <w:lang w:val="ru-RU"/>
-        </w:rPr>
-        <w:t xml:space="preserve"> на</w:t>
-      </w:r>
-      <w:r>
-        <w:rPr>
-          <w:rStyle w:val="Strong"/>
-          <w:rFonts w:eastAsia="Times New Roman" w:cs="Times New Roman" w:ascii="YS Text;apple-system;BlinkMacSystemFont;Arial;Helvetica;sans-serif" w:hAnsi="YS Text;apple-system;BlinkMacSystemFont;Arial;Helvetica;sans-serif"/>
-          <w:b w:val="false"/>
-          <w:i w:val="false"/>
-          <w:iCs w:val="false"/>
-          <w:caps w:val="false"/>
-          <w:smallCaps w:val="false"/>
-          <w:color w:val="000000"/>
-          <w:spacing w:val="0"/>
-          <w:sz w:val="24"/>
-          <w:szCs w:val="28"/>
-          <w:lang w:val="ru-RU"/>
-        </w:rPr>
-        <w:t xml:space="preserve"> </w:t>
-      </w:r>
-      <w:r>
-        <w:rPr>
-          <w:rStyle w:val="Strong"/>
-          <w:rFonts w:eastAsia="Times New Roman" w:cs="Times New Roman" w:ascii="YS Text;apple-system;BlinkMacSystemFont;Arial;Helvetica;sans-serif" w:hAnsi="YS Text;apple-system;BlinkMacSystemFont;Arial;Helvetica;sans-serif"/>
-          <w:b w:val="false"/>
-          <w:i w:val="false"/>
-          <w:iCs w:val="false"/>
-          <w:caps w:val="false"/>
-          <w:smallCaps w:val="false"/>
-          <w:color w:val="000000"/>
-          <w:spacing w:val="0"/>
-          <w:sz w:val="24"/>
-          <w:szCs w:val="28"/>
-          <w:lang w:val="en-US"/>
-        </w:rPr>
-        <w:t xml:space="preserve">HTML </w:t>
-      </w:r>
-      <w:r>
-        <w:rPr>
-          <w:rStyle w:val="Strong"/>
-          <w:rFonts w:eastAsia="Times New Roman" w:cs="Times New Roman" w:ascii="Times New Roman" w:hAnsi="Times New Roman"/>
-          <w:b w:val="false"/>
-          <w:i w:val="false"/>
-          <w:iCs w:val="false"/>
-          <w:caps w:val="false"/>
-          <w:smallCaps w:val="false"/>
-          <w:color w:val="000000"/>
-          <w:spacing w:val="0"/>
-          <w:sz w:val="28"/>
-          <w:szCs w:val="28"/>
-          <w:lang w:val="en-US"/>
-        </w:rPr>
-        <w:t xml:space="preserve">– </w:t>
-      </w:r>
-      <w:r>
-        <w:rPr>
-          <w:rStyle w:val="Strong"/>
-          <w:rFonts w:eastAsia="Times New Roman" w:cs="Times New Roman" w:ascii="Times New Roman" w:hAnsi="Times New Roman"/>
-          <w:b w:val="false"/>
-          <w:i w:val="false"/>
-          <w:iCs w:val="false"/>
-          <w:caps w:val="false"/>
-          <w:smallCaps w:val="false"/>
-          <w:color w:val="000000"/>
-          <w:spacing w:val="0"/>
-          <w:sz w:val="28"/>
-          <w:szCs w:val="28"/>
-          <w:lang w:val="ru-RU"/>
-        </w:rPr>
-        <w:t xml:space="preserve">языке </w:t>
-      </w:r>
-      <w:r>
-        <w:rPr>
-          <w:rStyle w:val="Strong"/>
-          <w:rFonts w:eastAsia="Times New Roman" w:cs="Times New Roman" w:ascii="Times New Roman" w:hAnsi="Times New Roman"/>
-          <w:b w:val="false"/>
-          <w:i w:val="false"/>
-          <w:iCs w:val="false"/>
-          <w:caps w:val="false"/>
-          <w:smallCaps w:val="false"/>
-          <w:color w:val="000000"/>
-          <w:spacing w:val="0"/>
-          <w:sz w:val="28"/>
-          <w:szCs w:val="28"/>
-          <w:lang w:val="ru-RU"/>
-        </w:rPr>
-        <w:t>гипертекстовой разметки</w:t>
-      </w:r>
-      <w:r>
-        <w:rPr>
-          <w:rStyle w:val="Strong"/>
-          <w:rFonts w:eastAsia="Times New Roman" w:cs="Times New Roman" w:ascii="Times New Roman" w:hAnsi="Times New Roman"/>
-          <w:b w:val="false"/>
-          <w:i w:val="false"/>
-          <w:iCs w:val="false"/>
-          <w:caps w:val="false"/>
-          <w:smallCaps w:val="false"/>
-          <w:color w:val="000000"/>
-          <w:spacing w:val="0"/>
-          <w:sz w:val="28"/>
-          <w:szCs w:val="28"/>
-          <w:lang w:val="ru-RU"/>
-        </w:rPr>
-        <w:t xml:space="preserve"> для структурирования и оформления </w:t>
-      </w:r>
-      <w:r>
-        <w:rPr>
-          <w:rStyle w:val="Strong"/>
-          <w:rFonts w:eastAsia="Times New Roman" w:cs="Times New Roman" w:ascii="Times New Roman" w:hAnsi="Times New Roman"/>
-          <w:b w:val="false"/>
-          <w:i w:val="false"/>
-          <w:iCs w:val="false"/>
-          <w:caps w:val="false"/>
-          <w:smallCaps w:val="false"/>
-          <w:color w:val="000000"/>
-          <w:spacing w:val="0"/>
-          <w:sz w:val="28"/>
-          <w:szCs w:val="28"/>
-          <w:lang w:val="ru-RU"/>
-        </w:rPr>
-        <w:t xml:space="preserve">с использованием классов </w:t>
-      </w:r>
-      <w:r>
-        <w:rPr>
-          <w:rStyle w:val="Strong"/>
-          <w:rFonts w:eastAsia="Times New Roman" w:cs="Times New Roman" w:ascii="Times New Roman" w:hAnsi="Times New Roman"/>
-          <w:b w:val="false"/>
-          <w:i w:val="false"/>
-          <w:iCs w:val="false"/>
-          <w:caps w:val="false"/>
-          <w:smallCaps w:val="false"/>
-          <w:color w:val="000000"/>
-          <w:spacing w:val="0"/>
-          <w:sz w:val="28"/>
-          <w:szCs w:val="28"/>
-          <w:lang w:val="en-US"/>
-        </w:rPr>
-        <w:t xml:space="preserve">Bootstrap, </w:t>
-      </w:r>
-      <w:r>
-        <w:rPr>
-          <w:rStyle w:val="Strong"/>
-          <w:rFonts w:eastAsia="Times New Roman" w:cs="Times New Roman" w:ascii="Times New Roman" w:hAnsi="Times New Roman"/>
-          <w:b w:val="false"/>
-          <w:i w:val="false"/>
-          <w:iCs w:val="false"/>
-          <w:caps w:val="false"/>
-          <w:smallCaps w:val="false"/>
-          <w:color w:val="000000"/>
-          <w:spacing w:val="0"/>
-          <w:sz w:val="28"/>
-          <w:szCs w:val="28"/>
-          <w:lang w:val="ru-RU"/>
-        </w:rPr>
-        <w:t xml:space="preserve">для динамичности сайта использовался язык </w:t>
-      </w:r>
-      <w:r>
-        <w:rPr>
-          <w:rStyle w:val="Strong"/>
-          <w:rFonts w:eastAsia="Times New Roman" w:cs="Times New Roman" w:ascii="Times New Roman" w:hAnsi="Times New Roman"/>
-          <w:b w:val="false"/>
-          <w:i w:val="false"/>
-          <w:iCs w:val="false"/>
-          <w:caps w:val="false"/>
-          <w:smallCaps w:val="false"/>
-          <w:color w:val="000000"/>
-          <w:spacing w:val="0"/>
-          <w:sz w:val="28"/>
-          <w:szCs w:val="28"/>
-          <w:lang w:val="en-US"/>
-        </w:rPr>
-        <w:t>JavaScript</w:t>
-      </w:r>
-      <w:r>
-        <w:rPr>
-          <w:rFonts w:eastAsia="Times New Roman" w:cs="Times New Roman" w:ascii="Times New Roman" w:hAnsi="Times New Roman"/>
-          <w:color w:val="000000"/>
-          <w:sz w:val="28"/>
-          <w:szCs w:val="28"/>
-        </w:rPr>
-        <w:t xml:space="preserve">. </w:t>
-      </w:r>
-      <w:r>
-        <w:rPr>
-          <w:rFonts w:eastAsia="Times New Roman" w:cs="Times New Roman" w:ascii="Times New Roman" w:hAnsi="Times New Roman"/>
-          <w:color w:val="000000"/>
-          <w:sz w:val="28"/>
-          <w:szCs w:val="28"/>
-        </w:rPr>
-        <w:t>Работа с БД выполнялась через библиотеку</w:t>
-      </w:r>
-      <w:r>
-        <w:rPr>
-          <w:rFonts w:eastAsia="Times New Roman" w:cs="Times New Roman" w:ascii="Times New Roman" w:hAnsi="Times New Roman"/>
-          <w:color w:val="000000"/>
-          <w:sz w:val="28"/>
-          <w:szCs w:val="28"/>
-          <w:lang w:val="en-US"/>
-        </w:rPr>
-        <w:t xml:space="preserve"> ORM sqlalchemy, </w:t>
-      </w:r>
-      <w:r>
-        <w:rPr>
-          <w:rFonts w:eastAsia="Times New Roman" w:cs="Times New Roman" w:ascii="Times New Roman" w:hAnsi="Times New Roman"/>
-          <w:color w:val="000000"/>
-          <w:sz w:val="28"/>
-          <w:szCs w:val="28"/>
-          <w:lang w:val="ru-RU"/>
-        </w:rPr>
-        <w:t xml:space="preserve">сама база данных — </w:t>
-      </w:r>
-      <w:r>
-        <w:rPr>
-          <w:rFonts w:eastAsia="Times New Roman" w:cs="Times New Roman" w:ascii="Times New Roman" w:hAnsi="Times New Roman"/>
-          <w:color w:val="000000"/>
-          <w:sz w:val="28"/>
-          <w:szCs w:val="28"/>
-          <w:lang w:val="en-US"/>
-        </w:rPr>
-        <w:t>SqlLite.</w:t>
-      </w:r>
-    </w:p>
-    <w:p>
-      <w:pPr>
-        <w:pStyle w:val="Normal"/>
-        <w:pBdr/>
-        <w:spacing w:lineRule="auto" w:line="360" w:before="0" w:after="0"/>
-        <w:jc w:val="both"/>
-        <w:rPr>
-          <w:rFonts w:ascii="Times New Roman" w:hAnsi="Times New Roman" w:eastAsia="Times New Roman" w:cs="Times New Roman"/>
-          <w:color w:val="000000"/>
-          <w:sz w:val="28"/>
-          <w:szCs w:val="28"/>
-        </w:rPr>
-      </w:pPr>
-      <w:r>
-        <w:rPr/>
-      </w:r>
+          <w:color w:val="000000"/>
+          <w:sz w:val="28"/>
+          <w:szCs w:val="28"/>
+        </w:rPr>
+        <w:t>Рефлексия</w:t>
+      </w:r>
+      <w:r>
+        <w:rPr>
+          <w:rFonts w:eastAsia="Times New Roman" w:cs="Times New Roman" w:ascii="Times New Roman" w:hAnsi="Times New Roman"/>
+          <w:color w:val="000000"/>
+          <w:sz w:val="28"/>
+          <w:szCs w:val="28"/>
+        </w:rPr>
+        <w:t xml:space="preserve"> – В процессе разработки проекта Велосборщик возникла проблема, связанная с недостатком деталей и сборок в базе данных. Изначально рассчитывалось, что заполнение БД необходимыми данными займет меньше времени, однако фактически этот процесс оказался более трудоемким. Отсутствие полноценной базы данных затрудняет полное тестирование функционала сайта и демонстрацию его возможностей потенциальным заказчикам.</w:t>
+      </w:r>
+      <w:bookmarkStart w:id="5" w:name="_heading=h.gjdgxs"/>
+      <w:bookmarkEnd w:id="5"/>
     </w:p>
     <w:p>
       <w:pPr>
@@ -3117,59 +2967,19 @@
           <w:ilvl w:val="0"/>
           <w:numId w:val="5"/>
         </w:numPr>
-        <w:rPr/>
-      </w:pPr>
-      <w:bookmarkStart w:id="5" w:name="__RefHeading___Toc870_3592309458"/>
-      <w:bookmarkEnd w:id="5"/>
-      <w:r>
-        <w:rPr/>
-        <w:t>Заключение</w:t>
-      </w:r>
-    </w:p>
-    <w:p>
-      <w:pPr>
-        <w:pStyle w:val="Normal"/>
-        <w:numPr>
-          <w:ilvl w:val="0"/>
-          <w:numId w:val="3"/>
-        </w:numPr>
-        <w:pBdr/>
-        <w:spacing w:lineRule="auto" w:line="360" w:before="0" w:after="0"/>
-        <w:jc w:val="both"/>
-        <w:rPr>
-          <w:rFonts w:ascii="Times New Roman" w:hAnsi="Times New Roman" w:eastAsia="Times New Roman" w:cs="Times New Roman"/>
-          <w:color w:val="000000"/>
-          <w:sz w:val="28"/>
-          <w:szCs w:val="28"/>
-        </w:rPr>
-      </w:pPr>
-      <w:r>
-        <w:rPr>
-          <w:rFonts w:eastAsia="Times New Roman" w:cs="Times New Roman" w:ascii="Times New Roman" w:hAnsi="Times New Roman"/>
-          <w:i/>
-          <w:color w:val="000000"/>
-          <w:sz w:val="28"/>
-          <w:szCs w:val="28"/>
-        </w:rPr>
-        <w:t>Рефлексия</w:t>
-      </w:r>
-      <w:r>
-        <w:rPr>
-          <w:rFonts w:eastAsia="Times New Roman" w:cs="Times New Roman" w:ascii="Times New Roman" w:hAnsi="Times New Roman"/>
-          <w:color w:val="000000"/>
-          <w:sz w:val="28"/>
-          <w:szCs w:val="28"/>
-        </w:rPr>
-        <w:t xml:space="preserve"> – </w:t>
-      </w:r>
-      <w:r>
-        <w:rPr>
-          <w:rFonts w:eastAsia="Times New Roman" w:cs="Times New Roman" w:ascii="Times New Roman" w:hAnsi="Times New Roman"/>
-          <w:color w:val="000000"/>
-          <w:sz w:val="28"/>
-          <w:szCs w:val="28"/>
-        </w:rPr>
-        <w:t>В процессе разработки проекта Велосборщик возникла проблема, связанная с недостатком деталей и сборок в базе данных. Изначально рассчитывалось, что заполнение БД необходимыми данными займет меньше времени, однако фактически этот процесс оказался более трудоемким. Отсутствие полноценной базы данных затрудняет полное тестирование функционала сайта и демонстрацию его возможностей потенциальным заказчикам.</w:t>
+        <w:spacing w:lineRule="auto" w:line="360" w:before="0" w:after="0"/>
+        <w:ind w:firstLine="709" w:left="0"/>
+        <w:rPr>
+          <w:rFonts w:ascii="Times New Roman" w:hAnsi="Times New Roman"/>
+        </w:rPr>
+      </w:pPr>
+      <w:bookmarkStart w:id="6" w:name="__RefHeading___Toc872_3592309458"/>
+      <w:bookmarkEnd w:id="6"/>
+      <w:r>
+        <w:rPr>
+          <w:rFonts w:ascii="Times New Roman" w:hAnsi="Times New Roman"/>
+        </w:rPr>
+        <w:t>Список литературы</w:t>
       </w:r>
     </w:p>
     <w:p>
@@ -3179,65 +2989,10 @@
           <w:ilvl w:val="0"/>
           <w:numId w:val="0"/>
         </w:numPr>
-        <w:pBdr/>
-        <w:spacing w:lineRule="auto" w:line="360" w:before="0" w:after="0"/>
-        <w:ind w:hanging="0" w:left="1287"/>
+        <w:spacing w:lineRule="auto" w:line="360" w:before="0" w:after="0"/>
+        <w:ind w:firstLine="709" w:left="0"/>
         <w:jc w:val="both"/>
-        <w:rPr>
-          <w:rFonts w:ascii="Times New Roman" w:hAnsi="Times New Roman" w:eastAsia="Times New Roman" w:cs="Times New Roman"/>
-          <w:color w:val="000000"/>
-          <w:sz w:val="28"/>
-          <w:szCs w:val="28"/>
-        </w:rPr>
-      </w:pPr>
-      <w:r>
-        <w:rPr>
-          <w:rFonts w:eastAsia="Times New Roman" w:cs="Times New Roman" w:ascii="Times New Roman" w:hAnsi="Times New Roman"/>
-          <w:color w:val="000000"/>
-          <w:sz w:val="28"/>
-          <w:szCs w:val="28"/>
-        </w:rPr>
-        <w:br/>
-        <w:t>К сожалению, это также повлияло на возможность привлечения заказчика, так как без достаточных данных не представляется возможным показать реальную работу сайта и его функциональность. Это подчеркивает важность предварительной подготовки и исследования, чтобы избежать задержек на поздних этапах разработки.</w:t>
-        <w:br/>
-        <w:t>В будущем стоит уделить больше внимания планированию и организации работы с данными. Возможно, стоит рассмотреть использование фиктивных данных для первоначального тестирования, чтобы можно было продемонстрировать рабочий прототип сайта. Кроме того, налаживание предварительных контактов с потенциальными заказчиками до завершения разработки также может помочь в понимании их потребностей и ожиданий.</w:t>
-      </w:r>
-      <w:bookmarkStart w:id="6" w:name="_heading=h.gjdgxs"/>
-      <w:bookmarkEnd w:id="6"/>
-    </w:p>
-    <w:p>
-      <w:pPr>
-        <w:pStyle w:val="Heading3"/>
-        <w:numPr>
-          <w:ilvl w:val="0"/>
-          <w:numId w:val="5"/>
-        </w:numPr>
         <w:rPr/>
-      </w:pPr>
-      <w:bookmarkStart w:id="7" w:name="__RefHeading___Toc872_3592309458"/>
-      <w:bookmarkEnd w:id="7"/>
-      <w:r>
-        <w:rPr/>
-        <w:t>Список литературы</w:t>
-      </w:r>
-    </w:p>
-    <w:p>
-      <w:pPr>
-        <w:pStyle w:val="Normal"/>
-        <w:numPr>
-          <w:ilvl w:val="0"/>
-          <w:numId w:val="0"/>
-        </w:numPr>
-        <w:pBdr/>
-        <w:spacing w:lineRule="auto" w:line="360"/>
-        <w:ind w:hanging="0" w:left="1287"/>
-        <w:jc w:val="both"/>
-        <w:rPr>
-          <w:rFonts w:ascii="Times New Roman" w:hAnsi="Times New Roman"/>
-          <w:sz w:val="28"/>
-          <w:szCs w:val="28"/>
-          <w:lang w:val="en-US"/>
-        </w:rPr>
       </w:pPr>
       <w:r>
         <w:rPr>
@@ -3268,16 +3023,10 @@
           <w:ilvl w:val="0"/>
           <w:numId w:val="0"/>
         </w:numPr>
-        <w:pBdr/>
-        <w:spacing w:lineRule="auto" w:line="360"/>
-        <w:ind w:hanging="0" w:left="1287"/>
+        <w:spacing w:lineRule="auto" w:line="360" w:before="0" w:after="0"/>
+        <w:ind w:firstLine="709" w:left="0"/>
         <w:jc w:val="both"/>
-        <w:rPr>
-          <w:rFonts w:ascii="Times New Roman" w:hAnsi="Times New Roman"/>
-          <w:sz w:val="28"/>
-          <w:szCs w:val="28"/>
-          <w:lang w:val="en-US"/>
-        </w:rPr>
+        <w:rPr/>
       </w:pPr>
       <w:r>
         <w:rPr>
@@ -3308,16 +3057,10 @@
           <w:ilvl w:val="0"/>
           <w:numId w:val="0"/>
         </w:numPr>
-        <w:pBdr/>
-        <w:spacing w:lineRule="auto" w:line="360"/>
-        <w:ind w:hanging="0" w:left="1287"/>
+        <w:spacing w:lineRule="auto" w:line="360" w:before="0" w:after="0"/>
+        <w:ind w:firstLine="709" w:left="0"/>
         <w:jc w:val="both"/>
-        <w:rPr>
-          <w:rFonts w:ascii="Times New Roman" w:hAnsi="Times New Roman"/>
-          <w:sz w:val="28"/>
-          <w:szCs w:val="28"/>
-          <w:lang w:val="en-US"/>
-        </w:rPr>
+        <w:rPr/>
       </w:pPr>
       <w:r>
         <w:rPr>
@@ -3348,16 +3091,10 @@
           <w:ilvl w:val="0"/>
           <w:numId w:val="0"/>
         </w:numPr>
-        <w:pBdr/>
-        <w:spacing w:lineRule="auto" w:line="360" w:before="0" w:after="160"/>
-        <w:ind w:hanging="0" w:left="1287"/>
+        <w:spacing w:lineRule="auto" w:line="360" w:before="0" w:after="0"/>
+        <w:ind w:firstLine="709" w:left="0"/>
         <w:jc w:val="both"/>
-        <w:rPr>
-          <w:rFonts w:ascii="Times New Roman" w:hAnsi="Times New Roman"/>
-          <w:sz w:val="28"/>
-          <w:szCs w:val="28"/>
-          <w:lang w:val="en-US"/>
-        </w:rPr>
+        <w:rPr/>
       </w:pPr>
       <w:r>
         <w:rPr>
@@ -3420,7 +3157,6 @@
   <w:p>
     <w:pPr>
       <w:pStyle w:val="Normal"/>
-      <w:pBdr/>
       <w:tabs>
         <w:tab w:val="clear" w:pos="720"/>
         <w:tab w:val="center" w:pos="4677" w:leader="none"/>
@@ -3433,40 +3169,29 @@
       </w:rPr>
     </w:pPr>
     <w:r>
-      <w:rPr>
-        <w:color w:val="000000"/>
-      </w:rPr>
+      <w:rPr/>
       <w:fldChar w:fldCharType="begin"/>
     </w:r>
     <w:r>
-      <w:rPr>
-        <w:color w:val="000000"/>
-      </w:rPr>
+      <w:rPr/>
       <w:instrText xml:space="preserve"> PAGE </w:instrText>
     </w:r>
     <w:r>
-      <w:rPr>
-        <w:color w:val="000000"/>
-      </w:rPr>
+      <w:rPr/>
       <w:fldChar w:fldCharType="separate"/>
     </w:r>
     <w:r>
-      <w:rPr>
-        <w:color w:val="000000"/>
-      </w:rPr>
-      <w:t>5</w:t>
+      <w:rPr/>
+      <w:t>6</w:t>
     </w:r>
     <w:r>
-      <w:rPr>
-        <w:color w:val="000000"/>
-      </w:rPr>
+      <w:rPr/>
       <w:fldChar w:fldCharType="end"/>
     </w:r>
   </w:p>
   <w:p>
     <w:pPr>
       <w:pStyle w:val="Normal"/>
-      <w:pBdr/>
       <w:tabs>
         <w:tab w:val="clear" w:pos="720"/>
         <w:tab w:val="center" w:pos="4677" w:leader="none"/>
@@ -3491,7 +3216,6 @@
   <w:p>
     <w:pPr>
       <w:pStyle w:val="Normal"/>
-      <w:pBdr/>
       <w:tabs>
         <w:tab w:val="clear" w:pos="720"/>
         <w:tab w:val="center" w:pos="4677" w:leader="none"/>
@@ -3544,7 +3268,6 @@
   <w:p>
     <w:pPr>
       <w:pStyle w:val="Normal"/>
-      <w:pBdr/>
       <w:tabs>
         <w:tab w:val="clear" w:pos="720"/>
         <w:tab w:val="center" w:pos="4677" w:leader="none"/>
@@ -4768,6 +4491,7 @@
     <w:qFormat/>
     <w:pPr>
       <w:widowControl/>
+      <w:suppressAutoHyphens w:val="true"/>
       <w:bidi w:val="0"/>
       <w:spacing w:lineRule="auto" w:line="259" w:before="0" w:after="160"/>
       <w:jc w:val="left"/>
@@ -4942,7 +4666,9 @@
   <w:style w:type="character" w:styleId="Style10">
     <w:name w:val="Символ сноски"/>
     <w:qFormat/>
-    <w:rPr/>
+    <w:rPr>
+      <w:vertAlign w:val="superscript"/>
+    </w:rPr>
   </w:style>
   <w:style w:type="character" w:styleId="FootnoteReference">
     <w:name w:val="footnote reference"/>
@@ -5154,6 +4880,7 @@
     <w:qFormat/>
     <w:pPr>
       <w:widowControl/>
+      <w:suppressAutoHyphens w:val="true"/>
       <w:bidi w:val="0"/>
       <w:spacing w:lineRule="auto" w:line="259" w:before="0" w:after="160"/>
       <w:jc w:val="left"/>

</xml_diff>